<commit_message>
CaF2 vs Ag/SiNWs: one-graph version with all four spectra on one count scale
Co-Authored-By: Claude Opus 5.5 <noreply@anthropic.com>
Claude-Session: https://claude.ai/code/session_01L8hQ8e5u5KmaH4dD9snyRw
</commit_message>
<xml_diff>
--- a/CaF2_vs_AgSiNW_Enhancement_Code.docx
+++ b/CaF2_vs_AgSiNW_Enhancement_Code.docx
@@ -55,7 +55,7 @@
         <w:spacing w:after="40"/>
       </w:pPr>
       <w:r>
-        <w:t>5. Run the file. The band table (signal/noise on Ag/SiNWs and on CaF2) is printed; CaF2_vs_AgSiNW_Enhancement.png / .tiff (600 dpi) and CaF2_vs_AgSiNW_bands.csv are saved in the same folder.</w:t>
+        <w:t>5. Run the file. The band table (signal/noise on Ag/SiNWs and on CaF2) is printed; CaF2_vs_AgSiNW_Enhancement (two panels) and CaF2_vs_AgSiNW_OneGraph (all four spectra in one graph), PNG + TIFF at 600 dpi, and CaF2_vs_AgSiNW_bands.csv are saved in the same folder.</w:t>
       </w:r>
     </w:p>
     <w:p>
@@ -385,7 +385,33 @@
           <w:sz w:val="15"/>
           <w:noProof/>
         </w:rPr>
-        <w:t># OUTPUT (in DATA_DIR): CaF2_vs_AgSiNW_Enhancement.png / .tiff (600 dpi) + CSV</w:t>
+        <w:t># OUTPUT (in DATA_DIR): CaF2_vs_AgSiNW_Enhancement.png / .tiff  (two panels, 600 dpi)</w:t>
+      </w:r>
+    </w:p>
+    <w:p>
+      <w:pPr>
+        <w:spacing w:before="0" w:after="0" w:line="240" w:lineRule="auto"/>
+      </w:pPr>
+      <w:r>
+        <w:rPr>
+          <w:rFonts w:ascii="Consolas" w:hAnsi="Consolas" w:eastAsia="Consolas" w:cs="Consolas"/>
+          <w:sz w:val="15"/>
+          <w:noProof/>
+        </w:rPr>
+        <w:t>#                       CaF2_vs_AgSiNW_OneGraph.png / .tiff     (all four in one graph)</w:t>
+      </w:r>
+    </w:p>
+    <w:p>
+      <w:pPr>
+        <w:spacing w:before="0" w:after="0" w:line="240" w:lineRule="auto"/>
+      </w:pPr>
+      <w:r>
+        <w:rPr>
+          <w:rFonts w:ascii="Consolas" w:hAnsi="Consolas" w:eastAsia="Consolas" w:cs="Consolas"/>
+          <w:sz w:val="15"/>
+          <w:noProof/>
+        </w:rPr>
+        <w:t>#                       CaF2_vs_AgSiNW_bands.csv</w:t>
       </w:r>
     </w:p>
     <w:p>
@@ -2660,6 +2686,1739 @@
           <w:noProof/>
         </w:rPr>
         <w:t>fig.savefig(DATA_DIR / 'CaF2_vs_AgSiNW_Enhancement.tiff', dpi=600, pil_kwargs={'compression': 'tiff_lzw'})</w:t>
+      </w:r>
+    </w:p>
+    <w:p>
+      <w:pPr>
+        <w:spacing w:before="0" w:after="0" w:line="240" w:lineRule="auto"/>
+      </w:pPr>
+      <w:r>
+        <w:rPr>
+          <w:rFonts w:ascii="Consolas" w:hAnsi="Consolas" w:eastAsia="Consolas" w:cs="Consolas"/>
+          <w:sz w:val="15"/>
+          <w:noProof/>
+        </w:rPr>
+        <w:t>plt.close(fig)</w:t>
+      </w:r>
+    </w:p>
+    <w:p>
+      <w:pPr>
+        <w:spacing w:before="0" w:after="0" w:line="240" w:lineRule="auto"/>
+      </w:pPr>
+      <w:r>
+        <w:rPr>
+          <w:rFonts w:ascii="Consolas" w:hAnsi="Consolas" w:eastAsia="Consolas" w:cs="Consolas"/>
+          <w:sz w:val="15"/>
+          <w:noProof/>
+        </w:rPr>
+      </w:r>
+    </w:p>
+    <w:p>
+      <w:pPr>
+        <w:spacing w:before="0" w:after="0" w:line="240" w:lineRule="auto"/>
+      </w:pPr>
+      <w:r>
+        <w:rPr>
+          <w:rFonts w:ascii="Consolas" w:hAnsi="Consolas" w:eastAsia="Consolas" w:cs="Consolas"/>
+          <w:sz w:val="15"/>
+          <w:noProof/>
+        </w:rPr>
+      </w:r>
+    </w:p>
+    <w:p>
+      <w:pPr>
+        <w:spacing w:before="0" w:after="0" w:line="240" w:lineRule="auto"/>
+      </w:pPr>
+      <w:r>
+        <w:rPr>
+          <w:rFonts w:ascii="Consolas" w:hAnsi="Consolas" w:eastAsia="Consolas" w:cs="Consolas"/>
+          <w:sz w:val="15"/>
+          <w:noProof/>
+        </w:rPr>
+        <w:t># ============================================================================</w:t>
+      </w:r>
+    </w:p>
+    <w:p>
+      <w:pPr>
+        <w:spacing w:before="0" w:after="0" w:line="240" w:lineRule="auto"/>
+      </w:pPr>
+      <w:r>
+        <w:rPr>
+          <w:rFonts w:ascii="Consolas" w:hAnsi="Consolas" w:eastAsia="Consolas" w:cs="Consolas"/>
+          <w:sz w:val="15"/>
+          <w:noProof/>
+        </w:rPr>
+        <w:t># 4. ONE-GRAPH VERSION: all four spectra in one plot, same count scale</w:t>
+      </w:r>
+    </w:p>
+    <w:p>
+      <w:pPr>
+        <w:spacing w:before="0" w:after="0" w:line="240" w:lineRule="auto"/>
+      </w:pPr>
+      <w:r>
+        <w:rPr>
+          <w:rFonts w:ascii="Consolas" w:hAnsi="Consolas" w:eastAsia="Consolas" w:cs="Consolas"/>
+          <w:sz w:val="15"/>
+          <w:noProof/>
+        </w:rPr>
+        <w:t>#    bottom -&gt; top: EV on CaF2, EV on Ag/SiNWs, NV on CaF2, NV on Ag/SiNWs</w:t>
+      </w:r>
+    </w:p>
+    <w:p>
+      <w:pPr>
+        <w:spacing w:before="0" w:after="0" w:line="240" w:lineRule="auto"/>
+      </w:pPr>
+      <w:r>
+        <w:rPr>
+          <w:rFonts w:ascii="Consolas" w:hAnsi="Consolas" w:eastAsia="Consolas" w:cs="Consolas"/>
+          <w:sz w:val="15"/>
+          <w:noProof/>
+        </w:rPr>
+        <w:t># ============================================================================</w:t>
+      </w:r>
+    </w:p>
+    <w:p>
+      <w:pPr>
+        <w:spacing w:before="0" w:after="0" w:line="240" w:lineRule="auto"/>
+      </w:pPr>
+      <w:r>
+        <w:rPr>
+          <w:rFonts w:ascii="Consolas" w:hAnsi="Consolas" w:eastAsia="Consolas" w:cs="Consolas"/>
+          <w:sz w:val="15"/>
+          <w:noProof/>
+        </w:rPr>
+        <w:t>ORDER = [('EV', 'CaF2'), ('EV', 'Ag'), ('NV', 'CaF2'), ('NV', 'Ag')]</w:t>
+      </w:r>
+    </w:p>
+    <w:p>
+      <w:pPr>
+        <w:spacing w:before="0" w:after="0" w:line="240" w:lineRule="auto"/>
+      </w:pPr>
+      <w:r>
+        <w:rPr>
+          <w:rFonts w:ascii="Consolas" w:hAnsi="Consolas" w:eastAsia="Consolas" w:cs="Consolas"/>
+          <w:sz w:val="15"/>
+          <w:noProof/>
+        </w:rPr>
+      </w:r>
+    </w:p>
+    <w:p>
+      <w:pPr>
+        <w:spacing w:before="0" w:after="0" w:line="240" w:lineRule="auto"/>
+      </w:pPr>
+      <w:r>
+        <w:rPr>
+          <w:rFonts w:ascii="Consolas" w:hAnsi="Consolas" w:eastAsia="Consolas" w:cs="Consolas"/>
+          <w:sz w:val="15"/>
+          <w:noProof/>
+        </w:rPr>
+      </w:r>
+    </w:p>
+    <w:p>
+      <w:pPr>
+        <w:spacing w:before="0" w:after="0" w:line="240" w:lineRule="auto"/>
+      </w:pPr>
+      <w:r>
+        <w:rPr>
+          <w:rFonts w:ascii="Consolas" w:hAnsi="Consolas" w:eastAsia="Consolas" w:cs="Consolas"/>
+          <w:sz w:val="15"/>
+          <w:noProof/>
+        </w:rPr>
+        <w:t>def label_positions(ax, s, fig):</w:t>
+      </w:r>
+    </w:p>
+    <w:p>
+      <w:pPr>
+        <w:spacing w:before="0" w:after="0" w:line="240" w:lineRule="auto"/>
+      </w:pPr>
+      <w:r>
+        <w:rPr>
+          <w:rFonts w:ascii="Consolas" w:hAnsi="Consolas" w:eastAsia="Consolas" w:cs="Consolas"/>
+          <w:sz w:val="15"/>
+          <w:noProof/>
+        </w:rPr>
+        <w:t xml:space="preserve">    """x positions of the labels of sample s, spread so they do not overlap."""</w:t>
+      </w:r>
+    </w:p>
+    <w:p>
+      <w:pPr>
+        <w:spacing w:before="0" w:after="0" w:line="240" w:lineRule="auto"/>
+      </w:pPr>
+      <w:r>
+        <w:rPr>
+          <w:rFonts w:ascii="Consolas" w:hAnsi="Consolas" w:eastAsia="Consolas" w:cs="Consolas"/>
+          <w:sz w:val="15"/>
+          <w:noProof/>
+        </w:rPr>
+        <w:t xml:space="preserve">    out = {}</w:t>
+      </w:r>
+    </w:p>
+    <w:p>
+      <w:pPr>
+        <w:spacing w:before="0" w:after="0" w:line="240" w:lineRule="auto"/>
+      </w:pPr>
+      <w:r>
+        <w:rPr>
+          <w:rFonts w:ascii="Consolas" w:hAnsi="Consolas" w:eastAsia="Consolas" w:cs="Consolas"/>
+          <w:sz w:val="15"/>
+          <w:noProof/>
+        </w:rPr>
+        <w:t xml:space="preserve">    for lo, hi in [LOW, HIGH]:</w:t>
+      </w:r>
+    </w:p>
+    <w:p>
+      <w:pPr>
+        <w:spacing w:before="0" w:after="0" w:line="240" w:lineRule="auto"/>
+      </w:pPr>
+      <w:r>
+        <w:rPr>
+          <w:rFonts w:ascii="Consolas" w:hAnsi="Consolas" w:eastAsia="Consolas" w:cs="Consolas"/>
+          <w:sz w:val="15"/>
+          <w:noProof/>
+        </w:rPr>
+        <w:t xml:space="preserve">        sel = sorted((p, c) for p, c in labels[s] if lo &lt;= p &lt;= hi)</w:t>
+      </w:r>
+    </w:p>
+    <w:p>
+      <w:pPr>
+        <w:spacing w:before="0" w:after="0" w:line="240" w:lineRule="auto"/>
+      </w:pPr>
+      <w:r>
+        <w:rPr>
+          <w:rFonts w:ascii="Consolas" w:hAnsi="Consolas" w:eastAsia="Consolas" w:cs="Consolas"/>
+          <w:sz w:val="15"/>
+          <w:noProof/>
+        </w:rPr>
+        <w:t xml:space="preserve">        if not sel:</w:t>
+      </w:r>
+    </w:p>
+    <w:p>
+      <w:pPr>
+        <w:spacing w:before="0" w:after="0" w:line="240" w:lineRule="auto"/>
+      </w:pPr>
+      <w:r>
+        <w:rPr>
+          <w:rFonts w:ascii="Consolas" w:hAnsi="Consolas" w:eastAsia="Consolas" w:cs="Consolas"/>
+          <w:sz w:val="15"/>
+          <w:noProof/>
+        </w:rPr>
+        <w:t xml:space="preserve">            continue</w:t>
+      </w:r>
+    </w:p>
+    <w:p>
+      <w:pPr>
+        <w:spacing w:before="0" w:after="0" w:line="240" w:lineRule="auto"/>
+      </w:pPr>
+      <w:r>
+        <w:rPr>
+          <w:rFonts w:ascii="Consolas" w:hAnsi="Consolas" w:eastAsia="Consolas" w:cs="Consolas"/>
+          <w:sz w:val="15"/>
+          <w:noProof/>
+        </w:rPr>
+        <w:t xml:space="preserve">        a = ax[0] if (lo, hi) == LOW else ax[1]</w:t>
+      </w:r>
+    </w:p>
+    <w:p>
+      <w:pPr>
+        <w:spacing w:before="0" w:after="0" w:line="240" w:lineRule="auto"/>
+      </w:pPr>
+      <w:r>
+        <w:rPr>
+          <w:rFonts w:ascii="Consolas" w:hAnsi="Consolas" w:eastAsia="Consolas" w:cs="Consolas"/>
+          <w:sz w:val="15"/>
+          <w:noProof/>
+        </w:rPr>
+        <w:t xml:space="preserve">        probe = a.text(0, 0, '0', rotation=90, fontsize=FS_LABEL)</w:t>
+      </w:r>
+    </w:p>
+    <w:p>
+      <w:pPr>
+        <w:spacing w:before="0" w:after="0" w:line="240" w:lineRule="auto"/>
+      </w:pPr>
+      <w:r>
+        <w:rPr>
+          <w:rFonts w:ascii="Consolas" w:hAnsi="Consolas" w:eastAsia="Consolas" w:cs="Consolas"/>
+          <w:sz w:val="15"/>
+          <w:noProof/>
+        </w:rPr>
+        <w:t xml:space="preserve">        fig.canvas.draw()</w:t>
+      </w:r>
+    </w:p>
+    <w:p>
+      <w:pPr>
+        <w:spacing w:before="0" w:after="0" w:line="240" w:lineRule="auto"/>
+      </w:pPr>
+      <w:r>
+        <w:rPr>
+          <w:rFonts w:ascii="Consolas" w:hAnsi="Consolas" w:eastAsia="Consolas" w:cs="Consolas"/>
+          <w:sz w:val="15"/>
+          <w:noProof/>
+        </w:rPr>
+        <w:t xml:space="preserve">        bb = probe.get_window_extent().transformed(a.transData.inverted())</w:t>
+      </w:r>
+    </w:p>
+    <w:p>
+      <w:pPr>
+        <w:spacing w:before="0" w:after="0" w:line="240" w:lineRule="auto"/>
+      </w:pPr>
+      <w:r>
+        <w:rPr>
+          <w:rFonts w:ascii="Consolas" w:hAnsi="Consolas" w:eastAsia="Consolas" w:cs="Consolas"/>
+          <w:sz w:val="15"/>
+          <w:noProof/>
+        </w:rPr>
+        <w:t xml:space="preserve">        wl = bb.x1 - bb.x0</w:t>
+      </w:r>
+    </w:p>
+    <w:p>
+      <w:pPr>
+        <w:spacing w:before="0" w:after="0" w:line="240" w:lineRule="auto"/>
+      </w:pPr>
+      <w:r>
+        <w:rPr>
+          <w:rFonts w:ascii="Consolas" w:hAnsi="Consolas" w:eastAsia="Consolas" w:cs="Consolas"/>
+          <w:sz w:val="15"/>
+          <w:noProof/>
+        </w:rPr>
+        <w:t xml:space="preserve">        probe.remove()</w:t>
+      </w:r>
+    </w:p>
+    <w:p>
+      <w:pPr>
+        <w:spacing w:before="0" w:after="0" w:line="240" w:lineRule="auto"/>
+      </w:pPr>
+      <w:r>
+        <w:rPr>
+          <w:rFonts w:ascii="Consolas" w:hAnsi="Consolas" w:eastAsia="Consolas" w:cs="Consolas"/>
+          <w:sz w:val="15"/>
+          <w:noProof/>
+        </w:rPr>
+        <w:t xml:space="preserve">        xl = [p for p, _ in sel]</w:t>
+      </w:r>
+    </w:p>
+    <w:p>
+      <w:pPr>
+        <w:spacing w:before="0" w:after="0" w:line="240" w:lineRule="auto"/>
+      </w:pPr>
+      <w:r>
+        <w:rPr>
+          <w:rFonts w:ascii="Consolas" w:hAnsi="Consolas" w:eastAsia="Consolas" w:cs="Consolas"/>
+          <w:sz w:val="15"/>
+          <w:noProof/>
+        </w:rPr>
+        <w:t xml:space="preserve">        for _ in range(200):</w:t>
+      </w:r>
+    </w:p>
+    <w:p>
+      <w:pPr>
+        <w:spacing w:before="0" w:after="0" w:line="240" w:lineRule="auto"/>
+      </w:pPr>
+      <w:r>
+        <w:rPr>
+          <w:rFonts w:ascii="Consolas" w:hAnsi="Consolas" w:eastAsia="Consolas" w:cs="Consolas"/>
+          <w:sz w:val="15"/>
+          <w:noProof/>
+        </w:rPr>
+        <w:t xml:space="preserve">            moved = False</w:t>
+      </w:r>
+    </w:p>
+    <w:p>
+      <w:pPr>
+        <w:spacing w:before="0" w:after="0" w:line="240" w:lineRule="auto"/>
+      </w:pPr>
+      <w:r>
+        <w:rPr>
+          <w:rFonts w:ascii="Consolas" w:hAnsi="Consolas" w:eastAsia="Consolas" w:cs="Consolas"/>
+          <w:sz w:val="15"/>
+          <w:noProof/>
+        </w:rPr>
+        <w:t xml:space="preserve">            for i in range(1, len(xl)):</w:t>
+      </w:r>
+    </w:p>
+    <w:p>
+      <w:pPr>
+        <w:spacing w:before="0" w:after="0" w:line="240" w:lineRule="auto"/>
+      </w:pPr>
+      <w:r>
+        <w:rPr>
+          <w:rFonts w:ascii="Consolas" w:hAnsi="Consolas" w:eastAsia="Consolas" w:cs="Consolas"/>
+          <w:sz w:val="15"/>
+          <w:noProof/>
+        </w:rPr>
+        <w:t xml:space="preserve">                if xl[i] - xl[i - 1] &lt; wl * 1.1:</w:t>
+      </w:r>
+    </w:p>
+    <w:p>
+      <w:pPr>
+        <w:spacing w:before="0" w:after="0" w:line="240" w:lineRule="auto"/>
+      </w:pPr>
+      <w:r>
+        <w:rPr>
+          <w:rFonts w:ascii="Consolas" w:hAnsi="Consolas" w:eastAsia="Consolas" w:cs="Consolas"/>
+          <w:sz w:val="15"/>
+          <w:noProof/>
+        </w:rPr>
+        <w:t xml:space="preserve">                    mid = (xl[i] + xl[i - 1]) / 2</w:t>
+      </w:r>
+    </w:p>
+    <w:p>
+      <w:pPr>
+        <w:spacing w:before="0" w:after="0" w:line="240" w:lineRule="auto"/>
+      </w:pPr>
+      <w:r>
+        <w:rPr>
+          <w:rFonts w:ascii="Consolas" w:hAnsi="Consolas" w:eastAsia="Consolas" w:cs="Consolas"/>
+          <w:sz w:val="15"/>
+          <w:noProof/>
+        </w:rPr>
+        <w:t xml:space="preserve">                    xl[i - 1], xl[i] = mid - wl * 0.55, mid + wl * 0.55</w:t>
+      </w:r>
+    </w:p>
+    <w:p>
+      <w:pPr>
+        <w:spacing w:before="0" w:after="0" w:line="240" w:lineRule="auto"/>
+      </w:pPr>
+      <w:r>
+        <w:rPr>
+          <w:rFonts w:ascii="Consolas" w:hAnsi="Consolas" w:eastAsia="Consolas" w:cs="Consolas"/>
+          <w:sz w:val="15"/>
+          <w:noProof/>
+        </w:rPr>
+        <w:t xml:space="preserve">                    moved = True</w:t>
+      </w:r>
+    </w:p>
+    <w:p>
+      <w:pPr>
+        <w:spacing w:before="0" w:after="0" w:line="240" w:lineRule="auto"/>
+      </w:pPr>
+      <w:r>
+        <w:rPr>
+          <w:rFonts w:ascii="Consolas" w:hAnsi="Consolas" w:eastAsia="Consolas" w:cs="Consolas"/>
+          <w:sz w:val="15"/>
+          <w:noProof/>
+        </w:rPr>
+        <w:t xml:space="preserve">            if not moved:</w:t>
+      </w:r>
+    </w:p>
+    <w:p>
+      <w:pPr>
+        <w:spacing w:before="0" w:after="0" w:line="240" w:lineRule="auto"/>
+      </w:pPr>
+      <w:r>
+        <w:rPr>
+          <w:rFonts w:ascii="Consolas" w:hAnsi="Consolas" w:eastAsia="Consolas" w:cs="Consolas"/>
+          <w:sz w:val="15"/>
+          <w:noProof/>
+        </w:rPr>
+        <w:t xml:space="preserve">                break</w:t>
+      </w:r>
+    </w:p>
+    <w:p>
+      <w:pPr>
+        <w:spacing w:before="0" w:after="0" w:line="240" w:lineRule="auto"/>
+      </w:pPr>
+      <w:r>
+        <w:rPr>
+          <w:rFonts w:ascii="Consolas" w:hAnsi="Consolas" w:eastAsia="Consolas" w:cs="Consolas"/>
+          <w:sz w:val="15"/>
+          <w:noProof/>
+        </w:rPr>
+        <w:t xml:space="preserve">        out[(lo, hi)] = (a, sel, xl, wl)</w:t>
+      </w:r>
+    </w:p>
+    <w:p>
+      <w:pPr>
+        <w:spacing w:before="0" w:after="0" w:line="240" w:lineRule="auto"/>
+      </w:pPr>
+      <w:r>
+        <w:rPr>
+          <w:rFonts w:ascii="Consolas" w:hAnsi="Consolas" w:eastAsia="Consolas" w:cs="Consolas"/>
+          <w:sz w:val="15"/>
+          <w:noProof/>
+        </w:rPr>
+        <w:t xml:space="preserve">    return out</w:t>
+      </w:r>
+    </w:p>
+    <w:p>
+      <w:pPr>
+        <w:spacing w:before="0" w:after="0" w:line="240" w:lineRule="auto"/>
+      </w:pPr>
+      <w:r>
+        <w:rPr>
+          <w:rFonts w:ascii="Consolas" w:hAnsi="Consolas" w:eastAsia="Consolas" w:cs="Consolas"/>
+          <w:sz w:val="15"/>
+          <w:noProof/>
+        </w:rPr>
+      </w:r>
+    </w:p>
+    <w:p>
+      <w:pPr>
+        <w:spacing w:before="0" w:after="0" w:line="240" w:lineRule="auto"/>
+      </w:pPr>
+      <w:r>
+        <w:rPr>
+          <w:rFonts w:ascii="Consolas" w:hAnsi="Consolas" w:eastAsia="Consolas" w:cs="Consolas"/>
+          <w:sz w:val="15"/>
+          <w:noProof/>
+        </w:rPr>
+      </w:r>
+    </w:p>
+    <w:p>
+      <w:pPr>
+        <w:spacing w:before="0" w:after="0" w:line="240" w:lineRule="auto"/>
+      </w:pPr>
+      <w:r>
+        <w:rPr>
+          <w:rFonts w:ascii="Consolas" w:hAnsi="Consolas" w:eastAsia="Consolas" w:cs="Consolas"/>
+          <w:sz w:val="15"/>
+          <w:noProof/>
+        </w:rPr>
+        <w:t>def draw_one(label_room):</w:t>
+      </w:r>
+    </w:p>
+    <w:p>
+      <w:pPr>
+        <w:spacing w:before="0" w:after="0" w:line="240" w:lineRule="auto"/>
+      </w:pPr>
+      <w:r>
+        <w:rPr>
+          <w:rFonts w:ascii="Consolas" w:hAnsi="Consolas" w:eastAsia="Consolas" w:cs="Consolas"/>
+          <w:sz w:val="15"/>
+          <w:noProof/>
+        </w:rPr>
+        <w:t xml:space="preserve">    """Draw the single graph; return the figure and how much more space the EV</w:t>
+      </w:r>
+    </w:p>
+    <w:p>
+      <w:pPr>
+        <w:spacing w:before="0" w:after="0" w:line="240" w:lineRule="auto"/>
+      </w:pPr>
+      <w:r>
+        <w:rPr>
+          <w:rFonts w:ascii="Consolas" w:hAnsi="Consolas" w:eastAsia="Consolas" w:cs="Consolas"/>
+          <w:sz w:val="15"/>
+          <w:noProof/>
+        </w:rPr>
+        <w:t xml:space="preserve">    labels need so that they stay below the NV-on-CaF2 trace and its name."""</w:t>
+      </w:r>
+    </w:p>
+    <w:p>
+      <w:pPr>
+        <w:spacing w:before="0" w:after="0" w:line="240" w:lineRule="auto"/>
+      </w:pPr>
+      <w:r>
+        <w:rPr>
+          <w:rFonts w:ascii="Consolas" w:hAnsi="Consolas" w:eastAsia="Consolas" w:cs="Consolas"/>
+          <w:sz w:val="15"/>
+          <w:noProof/>
+        </w:rPr>
+        <w:t xml:space="preserve">    off, top = {}, None</w:t>
+      </w:r>
+    </w:p>
+    <w:p>
+      <w:pPr>
+        <w:spacing w:before="0" w:after="0" w:line="240" w:lineRule="auto"/>
+      </w:pPr>
+      <w:r>
+        <w:rPr>
+          <w:rFonts w:ascii="Consolas" w:hAnsi="Consolas" w:eastAsia="Consolas" w:cs="Consolas"/>
+          <w:sz w:val="15"/>
+          <w:noProof/>
+        </w:rPr>
+        <w:t xml:space="preserve">    for key in ORDER:                          # stack the traces with fixed gaps</w:t>
+      </w:r>
+    </w:p>
+    <w:p>
+      <w:pPr>
+        <w:spacing w:before="0" w:after="0" w:line="240" w:lineRule="auto"/>
+      </w:pPr>
+      <w:r>
+        <w:rPr>
+          <w:rFonts w:ascii="Consolas" w:hAnsi="Consolas" w:eastAsia="Consolas" w:cs="Consolas"/>
+          <w:sz w:val="15"/>
+          <w:noProof/>
+        </w:rPr>
+        <w:t xml:space="preserve">        d = spec[key]</w:t>
+      </w:r>
+    </w:p>
+    <w:p>
+      <w:pPr>
+        <w:spacing w:before="0" w:after="0" w:line="240" w:lineRule="auto"/>
+      </w:pPr>
+      <w:r>
+        <w:rPr>
+          <w:rFonts w:ascii="Consolas" w:hAnsi="Consolas" w:eastAsia="Consolas" w:cs="Consolas"/>
+          <w:sz w:val="15"/>
+          <w:noProof/>
+        </w:rPr>
+        <w:t xml:space="preserve">        yv = d[view(d), 1]</w:t>
+      </w:r>
+    </w:p>
+    <w:p>
+      <w:pPr>
+        <w:spacing w:before="0" w:after="0" w:line="240" w:lineRule="auto"/>
+      </w:pPr>
+      <w:r>
+        <w:rPr>
+          <w:rFonts w:ascii="Consolas" w:hAnsi="Consolas" w:eastAsia="Consolas" w:cs="Consolas"/>
+          <w:sz w:val="15"/>
+          <w:noProof/>
+        </w:rPr>
+        <w:t xml:space="preserve">        if top is None:</w:t>
+      </w:r>
+    </w:p>
+    <w:p>
+      <w:pPr>
+        <w:spacing w:before="0" w:after="0" w:line="240" w:lineRule="auto"/>
+      </w:pPr>
+      <w:r>
+        <w:rPr>
+          <w:rFonts w:ascii="Consolas" w:hAnsi="Consolas" w:eastAsia="Consolas" w:cs="Consolas"/>
+          <w:sz w:val="15"/>
+          <w:noProof/>
+        </w:rPr>
+        <w:t xml:space="preserve">            off[key] = 0.0</w:t>
+      </w:r>
+    </w:p>
+    <w:p>
+      <w:pPr>
+        <w:spacing w:before="0" w:after="0" w:line="240" w:lineRule="auto"/>
+      </w:pPr>
+      <w:r>
+        <w:rPr>
+          <w:rFonts w:ascii="Consolas" w:hAnsi="Consolas" w:eastAsia="Consolas" w:cs="Consolas"/>
+          <w:sz w:val="15"/>
+          <w:noProof/>
+        </w:rPr>
+        <w:t xml:space="preserve">        else:</w:t>
+      </w:r>
+    </w:p>
+    <w:p>
+      <w:pPr>
+        <w:spacing w:before="0" w:after="0" w:line="240" w:lineRule="auto"/>
+      </w:pPr>
+      <w:r>
+        <w:rPr>
+          <w:rFonts w:ascii="Consolas" w:hAnsi="Consolas" w:eastAsia="Consolas" w:cs="Consolas"/>
+          <w:sz w:val="15"/>
+          <w:noProof/>
+        </w:rPr>
+        <w:t xml:space="preserve">            gap = label_room if key == ('NV', 'CaF2') else GAP</w:t>
+      </w:r>
+    </w:p>
+    <w:p>
+      <w:pPr>
+        <w:spacing w:before="0" w:after="0" w:line="240" w:lineRule="auto"/>
+      </w:pPr>
+      <w:r>
+        <w:rPr>
+          <w:rFonts w:ascii="Consolas" w:hAnsi="Consolas" w:eastAsia="Consolas" w:cs="Consolas"/>
+          <w:sz w:val="15"/>
+          <w:noProof/>
+        </w:rPr>
+        <w:t xml:space="preserve">            off[key] = top + gap - yv.min()</w:t>
+      </w:r>
+    </w:p>
+    <w:p>
+      <w:pPr>
+        <w:spacing w:before="0" w:after="0" w:line="240" w:lineRule="auto"/>
+      </w:pPr>
+      <w:r>
+        <w:rPr>
+          <w:rFonts w:ascii="Consolas" w:hAnsi="Consolas" w:eastAsia="Consolas" w:cs="Consolas"/>
+          <w:sz w:val="15"/>
+          <w:noProof/>
+        </w:rPr>
+        <w:t xml:space="preserve">        top = yv.max() + off[key]</w:t>
+      </w:r>
+    </w:p>
+    <w:p>
+      <w:pPr>
+        <w:spacing w:before="0" w:after="0" w:line="240" w:lineRule="auto"/>
+      </w:pPr>
+      <w:r>
+        <w:rPr>
+          <w:rFonts w:ascii="Consolas" w:hAnsi="Consolas" w:eastAsia="Consolas" w:cs="Consolas"/>
+          <w:sz w:val="15"/>
+          <w:noProof/>
+        </w:rPr>
+        <w:t xml:space="preserve">    y_lo = spec[ORDER[0]][view(spec[ORDER[0]]), 1].min()</w:t>
+      </w:r>
+    </w:p>
+    <w:p>
+      <w:pPr>
+        <w:spacing w:before="0" w:after="0" w:line="240" w:lineRule="auto"/>
+      </w:pPr>
+      <w:r>
+        <w:rPr>
+          <w:rFonts w:ascii="Consolas" w:hAnsi="Consolas" w:eastAsia="Consolas" w:cs="Consolas"/>
+          <w:sz w:val="15"/>
+          <w:noProof/>
+        </w:rPr>
+        <w:t xml:space="preserve">    span = top - y_lo</w:t>
+      </w:r>
+    </w:p>
+    <w:p>
+      <w:pPr>
+        <w:spacing w:before="0" w:after="0" w:line="240" w:lineRule="auto"/>
+      </w:pPr>
+      <w:r>
+        <w:rPr>
+          <w:rFonts w:ascii="Consolas" w:hAnsi="Consolas" w:eastAsia="Consolas" w:cs="Consolas"/>
+          <w:sz w:val="15"/>
+          <w:noProof/>
+        </w:rPr>
+        <w:t xml:space="preserve">    fig, (axL, axR) = plt.subplots(1, 2, sharey=True, figsize=(11, 12),</w:t>
+      </w:r>
+    </w:p>
+    <w:p>
+      <w:pPr>
+        <w:spacing w:before="0" w:after="0" w:line="240" w:lineRule="auto"/>
+      </w:pPr>
+      <w:r>
+        <w:rPr>
+          <w:rFonts w:ascii="Consolas" w:hAnsi="Consolas" w:eastAsia="Consolas" w:cs="Consolas"/>
+          <w:sz w:val="15"/>
+          <w:noProof/>
+        </w:rPr>
+        <w:t xml:space="preserve">                                   gridspec_kw={'width_ratios': [LOW[1] - LOW[0], HIGH[1] - HIGH[0]],</w:t>
+      </w:r>
+    </w:p>
+    <w:p>
+      <w:pPr>
+        <w:spacing w:before="0" w:after="0" w:line="240" w:lineRule="auto"/>
+      </w:pPr>
+      <w:r>
+        <w:rPr>
+          <w:rFonts w:ascii="Consolas" w:hAnsi="Consolas" w:eastAsia="Consolas" w:cs="Consolas"/>
+          <w:sz w:val="15"/>
+          <w:noProof/>
+        </w:rPr>
+        <w:t xml:space="preserve">                                                'wspace': 0.03})</w:t>
+      </w:r>
+    </w:p>
+    <w:p>
+      <w:pPr>
+        <w:spacing w:before="0" w:after="0" w:line="240" w:lineRule="auto"/>
+      </w:pPr>
+      <w:r>
+        <w:rPr>
+          <w:rFonts w:ascii="Consolas" w:hAnsi="Consolas" w:eastAsia="Consolas" w:cs="Consolas"/>
+          <w:sz w:val="15"/>
+          <w:noProof/>
+        </w:rPr>
+        <w:t xml:space="preserve">    axL.set_ylim(y_lo - 0.06 * span, top + 0.28 * span)</w:t>
+      </w:r>
+    </w:p>
+    <w:p>
+      <w:pPr>
+        <w:spacing w:before="0" w:after="0" w:line="240" w:lineRule="auto"/>
+      </w:pPr>
+      <w:r>
+        <w:rPr>
+          <w:rFonts w:ascii="Consolas" w:hAnsi="Consolas" w:eastAsia="Consolas" w:cs="Consolas"/>
+          <w:sz w:val="15"/>
+          <w:noProof/>
+        </w:rPr>
+        <w:t xml:space="preserve">    for ax, (lo, hi) in [(axL, LOW), (axR, HIGH)]:</w:t>
+      </w:r>
+    </w:p>
+    <w:p>
+      <w:pPr>
+        <w:spacing w:before="0" w:after="0" w:line="240" w:lineRule="auto"/>
+      </w:pPr>
+      <w:r>
+        <w:rPr>
+          <w:rFonts w:ascii="Consolas" w:hAnsi="Consolas" w:eastAsia="Consolas" w:cs="Consolas"/>
+          <w:sz w:val="15"/>
+          <w:noProof/>
+        </w:rPr>
+        <w:t xml:space="preserve">        for s, sub in ORDER:</w:t>
+      </w:r>
+    </w:p>
+    <w:p>
+      <w:pPr>
+        <w:spacing w:before="0" w:after="0" w:line="240" w:lineRule="auto"/>
+      </w:pPr>
+      <w:r>
+        <w:rPr>
+          <w:rFonts w:ascii="Consolas" w:hAnsi="Consolas" w:eastAsia="Consolas" w:cs="Consolas"/>
+          <w:sz w:val="15"/>
+          <w:noProof/>
+        </w:rPr>
+        <w:t xml:space="preserve">            d = spec[(s, sub)]</w:t>
+      </w:r>
+    </w:p>
+    <w:p>
+      <w:pPr>
+        <w:spacing w:before="0" w:after="0" w:line="240" w:lineRule="auto"/>
+      </w:pPr>
+      <w:r>
+        <w:rPr>
+          <w:rFonts w:ascii="Consolas" w:hAnsi="Consolas" w:eastAsia="Consolas" w:cs="Consolas"/>
+          <w:sz w:val="15"/>
+          <w:noProof/>
+        </w:rPr>
+        <w:t xml:space="preserve">            m = (d[:, 0] &gt;= lo) &amp; (d[:, 0] &lt;= hi)</w:t>
+      </w:r>
+    </w:p>
+    <w:p>
+      <w:pPr>
+        <w:spacing w:before="0" w:after="0" w:line="240" w:lineRule="auto"/>
+      </w:pPr>
+      <w:r>
+        <w:rPr>
+          <w:rFonts w:ascii="Consolas" w:hAnsi="Consolas" w:eastAsia="Consolas" w:cs="Consolas"/>
+          <w:sz w:val="15"/>
+          <w:noProof/>
+        </w:rPr>
+        <w:t xml:space="preserve">            ax.plot(d[m, 0], d[m, 1] + off[(s, sub)], color=COL['CaF2'] if sub == 'CaF2' else COL[s],</w:t>
+      </w:r>
+    </w:p>
+    <w:p>
+      <w:pPr>
+        <w:spacing w:before="0" w:after="0" w:line="240" w:lineRule="auto"/>
+      </w:pPr>
+      <w:r>
+        <w:rPr>
+          <w:rFonts w:ascii="Consolas" w:hAnsi="Consolas" w:eastAsia="Consolas" w:cs="Consolas"/>
+          <w:sz w:val="15"/>
+          <w:noProof/>
+        </w:rPr>
+        <w:t xml:space="preserve">                    lw=0.8)</w:t>
+      </w:r>
+    </w:p>
+    <w:p>
+      <w:pPr>
+        <w:spacing w:before="0" w:after="0" w:line="240" w:lineRule="auto"/>
+      </w:pPr>
+      <w:r>
+        <w:rPr>
+          <w:rFonts w:ascii="Consolas" w:hAnsi="Consolas" w:eastAsia="Consolas" w:cs="Consolas"/>
+          <w:sz w:val="15"/>
+          <w:noProof/>
+        </w:rPr>
+        <w:t xml:space="preserve">        ax.set_xlim(lo, hi)</w:t>
+      </w:r>
+    </w:p>
+    <w:p>
+      <w:pPr>
+        <w:spacing w:before="0" w:after="0" w:line="240" w:lineRule="auto"/>
+      </w:pPr>
+      <w:r>
+        <w:rPr>
+          <w:rFonts w:ascii="Consolas" w:hAnsi="Consolas" w:eastAsia="Consolas" w:cs="Consolas"/>
+          <w:sz w:val="15"/>
+          <w:noProof/>
+        </w:rPr>
+        <w:t xml:space="preserve">        ax.tick_params(direction='in', length=6, width=1.0, labelsize=FS_TICK)</w:t>
+      </w:r>
+    </w:p>
+    <w:p>
+      <w:pPr>
+        <w:spacing w:before="0" w:after="0" w:line="240" w:lineRule="auto"/>
+      </w:pPr>
+      <w:r>
+        <w:rPr>
+          <w:rFonts w:ascii="Consolas" w:hAnsi="Consolas" w:eastAsia="Consolas" w:cs="Consolas"/>
+          <w:sz w:val="15"/>
+          <w:noProof/>
+        </w:rPr>
+        <w:t xml:space="preserve">    axL.spines['right'].set_visible(False)</w:t>
+      </w:r>
+    </w:p>
+    <w:p>
+      <w:pPr>
+        <w:spacing w:before="0" w:after="0" w:line="240" w:lineRule="auto"/>
+      </w:pPr>
+      <w:r>
+        <w:rPr>
+          <w:rFonts w:ascii="Consolas" w:hAnsi="Consolas" w:eastAsia="Consolas" w:cs="Consolas"/>
+          <w:sz w:val="15"/>
+          <w:noProof/>
+        </w:rPr>
+        <w:t xml:space="preserve">    axR.spines['left'].set_visible(False)</w:t>
+      </w:r>
+    </w:p>
+    <w:p>
+      <w:pPr>
+        <w:spacing w:before="0" w:after="0" w:line="240" w:lineRule="auto"/>
+      </w:pPr>
+      <w:r>
+        <w:rPr>
+          <w:rFonts w:ascii="Consolas" w:hAnsi="Consolas" w:eastAsia="Consolas" w:cs="Consolas"/>
+          <w:sz w:val="15"/>
+          <w:noProof/>
+        </w:rPr>
+        <w:t xml:space="preserve">    axL.tick_params(labelleft=False)</w:t>
+      </w:r>
+    </w:p>
+    <w:p>
+      <w:pPr>
+        <w:spacing w:before="0" w:after="0" w:line="240" w:lineRule="auto"/>
+      </w:pPr>
+      <w:r>
+        <w:rPr>
+          <w:rFonts w:ascii="Consolas" w:hAnsi="Consolas" w:eastAsia="Consolas" w:cs="Consolas"/>
+          <w:sz w:val="15"/>
+          <w:noProof/>
+        </w:rPr>
+        <w:t xml:space="preserve">    axR.tick_params(left=False, right=True, labelleft=False)</w:t>
+      </w:r>
+    </w:p>
+    <w:p>
+      <w:pPr>
+        <w:spacing w:before="0" w:after="0" w:line="240" w:lineRule="auto"/>
+      </w:pPr>
+      <w:r>
+        <w:rPr>
+          <w:rFonts w:ascii="Consolas" w:hAnsi="Consolas" w:eastAsia="Consolas" w:cs="Consolas"/>
+          <w:sz w:val="15"/>
+          <w:noProof/>
+        </w:rPr>
+        <w:t xml:space="preserve">    axL.set_xticks([400, 600, 800, 1000, 1200, 1400, 1600])</w:t>
+      </w:r>
+    </w:p>
+    <w:p>
+      <w:pPr>
+        <w:spacing w:before="0" w:after="0" w:line="240" w:lineRule="auto"/>
+      </w:pPr>
+      <w:r>
+        <w:rPr>
+          <w:rFonts w:ascii="Consolas" w:hAnsi="Consolas" w:eastAsia="Consolas" w:cs="Consolas"/>
+          <w:sz w:val="15"/>
+          <w:noProof/>
+        </w:rPr>
+        <w:t xml:space="preserve">    axR.set_xticks([2800, 3000])</w:t>
+      </w:r>
+    </w:p>
+    <w:p>
+      <w:pPr>
+        <w:spacing w:before="0" w:after="0" w:line="240" w:lineRule="auto"/>
+      </w:pPr>
+      <w:r>
+        <w:rPr>
+          <w:rFonts w:ascii="Consolas" w:hAnsi="Consolas" w:eastAsia="Consolas" w:cs="Consolas"/>
+          <w:sz w:val="15"/>
+          <w:noProof/>
+        </w:rPr>
+        <w:t xml:space="preserve">    axL.set_ylabel('Raman Intensity (a.u.)', fontsize=FS_AXIS)</w:t>
+      </w:r>
+    </w:p>
+    <w:p>
+      <w:pPr>
+        <w:spacing w:before="0" w:after="0" w:line="240" w:lineRule="auto"/>
+      </w:pPr>
+      <w:r>
+        <w:rPr>
+          <w:rFonts w:ascii="Consolas" w:hAnsi="Consolas" w:eastAsia="Consolas" w:cs="Consolas"/>
+          <w:sz w:val="15"/>
+          <w:noProof/>
+        </w:rPr>
+        <w:t xml:space="preserve">    fig.text(0.53, 0.015, 'Raman Shift (cm$^{-1}$)', ha='center', fontsize=FS_AXIS)</w:t>
+      </w:r>
+    </w:p>
+    <w:p>
+      <w:pPr>
+        <w:spacing w:before="0" w:after="0" w:line="240" w:lineRule="auto"/>
+      </w:pPr>
+      <w:r>
+        <w:rPr>
+          <w:rFonts w:ascii="Consolas" w:hAnsi="Consolas" w:eastAsia="Consolas" w:cs="Consolas"/>
+          <w:sz w:val="15"/>
+          <w:noProof/>
+        </w:rPr>
+        <w:t xml:space="preserve">    fig.subplots_adjust(left=0.07, right=0.98, bottom=0.07, top=0.98)</w:t>
+      </w:r>
+    </w:p>
+    <w:p>
+      <w:pPr>
+        <w:spacing w:before="0" w:after="0" w:line="240" w:lineRule="auto"/>
+      </w:pPr>
+      <w:r>
+        <w:rPr>
+          <w:rFonts w:ascii="Consolas" w:hAnsi="Consolas" w:eastAsia="Consolas" w:cs="Consolas"/>
+          <w:sz w:val="15"/>
+          <w:noProof/>
+        </w:rPr>
+        <w:t xml:space="preserve">    fig.canvas.draw()</w:t>
+      </w:r>
+    </w:p>
+    <w:p>
+      <w:pPr>
+        <w:spacing w:before="0" w:after="0" w:line="240" w:lineRule="auto"/>
+      </w:pPr>
+      <w:r>
+        <w:rPr>
+          <w:rFonts w:ascii="Consolas" w:hAnsi="Consolas" w:eastAsia="Consolas" w:cs="Consolas"/>
+          <w:sz w:val="15"/>
+          <w:noProof/>
+        </w:rPr>
+        <w:t xml:space="preserve">    # names below each trace</w:t>
+      </w:r>
+    </w:p>
+    <w:p>
+      <w:pPr>
+        <w:spacing w:before="0" w:after="0" w:line="240" w:lineRule="auto"/>
+      </w:pPr>
+      <w:r>
+        <w:rPr>
+          <w:rFonts w:ascii="Consolas" w:hAnsi="Consolas" w:eastAsia="Consolas" w:cs="Consolas"/>
+          <w:sz w:val="15"/>
+          <w:noProof/>
+        </w:rPr>
+        <w:t xml:space="preserve">    nv_caf_name = None</w:t>
+      </w:r>
+    </w:p>
+    <w:p>
+      <w:pPr>
+        <w:spacing w:before="0" w:after="0" w:line="240" w:lineRule="auto"/>
+      </w:pPr>
+      <w:r>
+        <w:rPr>
+          <w:rFonts w:ascii="Consolas" w:hAnsi="Consolas" w:eastAsia="Consolas" w:cs="Consolas"/>
+          <w:sz w:val="15"/>
+          <w:noProof/>
+        </w:rPr>
+        <w:t xml:space="preserve">    for s, sub in ORDER:</w:t>
+      </w:r>
+    </w:p>
+    <w:p>
+      <w:pPr>
+        <w:spacing w:before="0" w:after="0" w:line="240" w:lineRule="auto"/>
+      </w:pPr>
+      <w:r>
+        <w:rPr>
+          <w:rFonts w:ascii="Consolas" w:hAnsi="Consolas" w:eastAsia="Consolas" w:cs="Consolas"/>
+          <w:sz w:val="15"/>
+          <w:noProof/>
+        </w:rPr>
+        <w:t xml:space="preserve">        d = spec[(s, sub)]</w:t>
+      </w:r>
+    </w:p>
+    <w:p>
+      <w:pPr>
+        <w:spacing w:before="0" w:after="0" w:line="240" w:lineRule="auto"/>
+      </w:pPr>
+      <w:r>
+        <w:rPr>
+          <w:rFonts w:ascii="Consolas" w:hAnsi="Consolas" w:eastAsia="Consolas" w:cs="Consolas"/>
+          <w:sz w:val="15"/>
+          <w:noProof/>
+        </w:rPr>
+        <w:t xml:space="preserve">        m = (d[:, 0] &gt;= 410) &amp; (d[:, 0] &lt;= 900)</w:t>
+      </w:r>
+    </w:p>
+    <w:p>
+      <w:pPr>
+        <w:spacing w:before="0" w:after="0" w:line="240" w:lineRule="auto"/>
+      </w:pPr>
+      <w:r>
+        <w:rPr>
+          <w:rFonts w:ascii="Consolas" w:hAnsi="Consolas" w:eastAsia="Consolas" w:cs="Consolas"/>
+          <w:sz w:val="15"/>
+          <w:noProof/>
+        </w:rPr>
+        <w:t xml:space="preserve">        txt = f'{NAME[s]} on ' + ('CaF$_2$' if sub == 'CaF2' else 'Ag/SiNWs')</w:t>
+      </w:r>
+    </w:p>
+    <w:p>
+      <w:pPr>
+        <w:spacing w:before="0" w:after="0" w:line="240" w:lineRule="auto"/>
+      </w:pPr>
+      <w:r>
+        <w:rPr>
+          <w:rFonts w:ascii="Consolas" w:hAnsi="Consolas" w:eastAsia="Consolas" w:cs="Consolas"/>
+          <w:sz w:val="15"/>
+          <w:noProof/>
+        </w:rPr>
+        <w:t xml:space="preserve">        t = axL.text(415, d[m, 1].min() + off[(s, sub)] - 0.008 * span, txt,</w:t>
+      </w:r>
+    </w:p>
+    <w:p>
+      <w:pPr>
+        <w:spacing w:before="0" w:after="0" w:line="240" w:lineRule="auto"/>
+      </w:pPr>
+      <w:r>
+        <w:rPr>
+          <w:rFonts w:ascii="Consolas" w:hAnsi="Consolas" w:eastAsia="Consolas" w:cs="Consolas"/>
+          <w:sz w:val="15"/>
+          <w:noProof/>
+        </w:rPr>
+        <w:t xml:space="preserve">                     color=COL['CaF2'] if sub == 'CaF2' else COL[s], fontsize=FS_NAME, ha='left', va='top')</w:t>
+      </w:r>
+    </w:p>
+    <w:p>
+      <w:pPr>
+        <w:spacing w:before="0" w:after="0" w:line="240" w:lineRule="auto"/>
+      </w:pPr>
+      <w:r>
+        <w:rPr>
+          <w:rFonts w:ascii="Consolas" w:hAnsi="Consolas" w:eastAsia="Consolas" w:cs="Consolas"/>
+          <w:sz w:val="15"/>
+          <w:noProof/>
+        </w:rPr>
+        <w:t xml:space="preserve">        if (s, sub) == ('NV', 'CaF2'):</w:t>
+      </w:r>
+    </w:p>
+    <w:p>
+      <w:pPr>
+        <w:spacing w:before="0" w:after="0" w:line="240" w:lineRule="auto"/>
+      </w:pPr>
+      <w:r>
+        <w:rPr>
+          <w:rFonts w:ascii="Consolas" w:hAnsi="Consolas" w:eastAsia="Consolas" w:cs="Consolas"/>
+          <w:sz w:val="15"/>
+          <w:noProof/>
+        </w:rPr>
+        <w:t xml:space="preserve">            fig.canvas.draw()</w:t>
+      </w:r>
+    </w:p>
+    <w:p>
+      <w:pPr>
+        <w:spacing w:before="0" w:after="0" w:line="240" w:lineRule="auto"/>
+      </w:pPr>
+      <w:r>
+        <w:rPr>
+          <w:rFonts w:ascii="Consolas" w:hAnsi="Consolas" w:eastAsia="Consolas" w:cs="Consolas"/>
+          <w:sz w:val="15"/>
+          <w:noProof/>
+        </w:rPr>
+        <w:t xml:space="preserve">            nv_caf_name = t.get_window_extent().transformed(axL.transData.inverted())</w:t>
+      </w:r>
+    </w:p>
+    <w:p>
+      <w:pPr>
+        <w:spacing w:before="0" w:after="0" w:line="240" w:lineRule="auto"/>
+      </w:pPr>
+      <w:r>
+        <w:rPr>
+          <w:rFonts w:ascii="Consolas" w:hAnsi="Consolas" w:eastAsia="Consolas" w:cs="Consolas"/>
+          <w:sz w:val="15"/>
+          <w:noProof/>
+        </w:rPr>
+        <w:t xml:space="preserve">    need = 0.0</w:t>
+      </w:r>
+    </w:p>
+    <w:p>
+      <w:pPr>
+        <w:spacing w:before="0" w:after="0" w:line="240" w:lineRule="auto"/>
+      </w:pPr>
+      <w:r>
+        <w:rPr>
+          <w:rFonts w:ascii="Consolas" w:hAnsi="Consolas" w:eastAsia="Consolas" w:cs="Consolas"/>
+          <w:sz w:val="15"/>
+          <w:noProof/>
+        </w:rPr>
+        <w:t xml:space="preserve">    for s in ['EV', 'NV']:</w:t>
+      </w:r>
+    </w:p>
+    <w:p>
+      <w:pPr>
+        <w:spacing w:before="0" w:after="0" w:line="240" w:lineRule="auto"/>
+      </w:pPr>
+      <w:r>
+        <w:rPr>
+          <w:rFonts w:ascii="Consolas" w:hAnsi="Consolas" w:eastAsia="Consolas" w:cs="Consolas"/>
+          <w:sz w:val="15"/>
+          <w:noProof/>
+        </w:rPr>
+        <w:t xml:space="preserve">        ag = spec[(s, 'Ag')]</w:t>
+      </w:r>
+    </w:p>
+    <w:p>
+      <w:pPr>
+        <w:spacing w:before="0" w:after="0" w:line="240" w:lineRule="auto"/>
+      </w:pPr>
+      <w:r>
+        <w:rPr>
+          <w:rFonts w:ascii="Consolas" w:hAnsi="Consolas" w:eastAsia="Consolas" w:cs="Consolas"/>
+          <w:sz w:val="15"/>
+          <w:noProof/>
+        </w:rPr>
+        <w:t xml:space="preserve">        o = off[(s, 'Ag')]</w:t>
+      </w:r>
+    </w:p>
+    <w:p>
+      <w:pPr>
+        <w:spacing w:before="0" w:after="0" w:line="240" w:lineRule="auto"/>
+      </w:pPr>
+      <w:r>
+        <w:rPr>
+          <w:rFonts w:ascii="Consolas" w:hAnsi="Consolas" w:eastAsia="Consolas" w:cs="Consolas"/>
+          <w:sz w:val="15"/>
+          <w:noProof/>
+        </w:rPr>
+        <w:t xml:space="preserve">        for (lo, hi), (a, sel, xl, wl) in label_positions((axL, axR), s, fig).items():</w:t>
+      </w:r>
+    </w:p>
+    <w:p>
+      <w:pPr>
+        <w:spacing w:before="0" w:after="0" w:line="240" w:lineRule="auto"/>
+      </w:pPr>
+      <w:r>
+        <w:rPr>
+          <w:rFonts w:ascii="Consolas" w:hAnsi="Consolas" w:eastAsia="Consolas" w:cs="Consolas"/>
+          <w:sz w:val="15"/>
+          <w:noProof/>
+        </w:rPr>
+        <w:t xml:space="preserve">            for (p, cls), xlab in zip(sel, xl):</w:t>
+      </w:r>
+    </w:p>
+    <w:p>
+      <w:pPr>
+        <w:spacing w:before="0" w:after="0" w:line="240" w:lineRule="auto"/>
+      </w:pPr>
+      <w:r>
+        <w:rPr>
+          <w:rFonts w:ascii="Consolas" w:hAnsi="Consolas" w:eastAsia="Consolas" w:cs="Consolas"/>
+          <w:sz w:val="15"/>
+          <w:noProof/>
+        </w:rPr>
+        <w:t xml:space="preserve">                near = (ag[:, 0] &gt;= min(p, xlab) - wl) &amp; (ag[:, 0] &lt;= max(p, xlab) + wl)</w:t>
+      </w:r>
+    </w:p>
+    <w:p>
+      <w:pPr>
+        <w:spacing w:before="0" w:after="0" w:line="240" w:lineRule="auto"/>
+      </w:pPr>
+      <w:r>
+        <w:rPr>
+          <w:rFonts w:ascii="Consolas" w:hAnsi="Consolas" w:eastAsia="Consolas" w:cs="Consolas"/>
+          <w:sz w:val="15"/>
+          <w:noProof/>
+        </w:rPr>
+        <w:t xml:space="preserve">                base = ag[near, 1].max() + o + 0.015 * span</w:t>
+      </w:r>
+    </w:p>
+    <w:p>
+      <w:pPr>
+        <w:spacing w:before="0" w:after="0" w:line="240" w:lineRule="auto"/>
+      </w:pPr>
+      <w:r>
+        <w:rPr>
+          <w:rFonts w:ascii="Consolas" w:hAnsi="Consolas" w:eastAsia="Consolas" w:cs="Consolas"/>
+          <w:sz w:val="15"/>
+          <w:noProof/>
+        </w:rPr>
+        <w:t xml:space="preserve">                h = a.text(xlab, base, f'{p}  {cls}', rotation=90, ha='center', va='bottom',</w:t>
+      </w:r>
+    </w:p>
+    <w:p>
+      <w:pPr>
+        <w:spacing w:before="0" w:after="0" w:line="240" w:lineRule="auto"/>
+      </w:pPr>
+      <w:r>
+        <w:rPr>
+          <w:rFonts w:ascii="Consolas" w:hAnsi="Consolas" w:eastAsia="Consolas" w:cs="Consolas"/>
+          <w:sz w:val="15"/>
+          <w:noProof/>
+        </w:rPr>
+        <w:t xml:space="preserve">                           fontsize=FS_LABEL, color=CLASS_COL[cls])</w:t>
+      </w:r>
+    </w:p>
+    <w:p>
+      <w:pPr>
+        <w:spacing w:before="0" w:after="0" w:line="240" w:lineRule="auto"/>
+      </w:pPr>
+      <w:r>
+        <w:rPr>
+          <w:rFonts w:ascii="Consolas" w:hAnsi="Consolas" w:eastAsia="Consolas" w:cs="Consolas"/>
+          <w:sz w:val="15"/>
+          <w:noProof/>
+        </w:rPr>
+        <w:t xml:space="preserve">                y_peak = ag[np.argmin(np.abs(ag[:, 0] - p)), 1] + o</w:t>
+      </w:r>
+    </w:p>
+    <w:p>
+      <w:pPr>
+        <w:spacing w:before="0" w:after="0" w:line="240" w:lineRule="auto"/>
+      </w:pPr>
+      <w:r>
+        <w:rPr>
+          <w:rFonts w:ascii="Consolas" w:hAnsi="Consolas" w:eastAsia="Consolas" w:cs="Consolas"/>
+          <w:sz w:val="15"/>
+          <w:noProof/>
+        </w:rPr>
+        <w:t xml:space="preserve">                a.plot([p, xlab], [y_peak + 0.005 * span, base - 0.003 * span], ls=(0, (1, 2)),</w:t>
+      </w:r>
+    </w:p>
+    <w:p>
+      <w:pPr>
+        <w:spacing w:before="0" w:after="0" w:line="240" w:lineRule="auto"/>
+      </w:pPr>
+      <w:r>
+        <w:rPr>
+          <w:rFonts w:ascii="Consolas" w:hAnsi="Consolas" w:eastAsia="Consolas" w:cs="Consolas"/>
+          <w:sz w:val="15"/>
+          <w:noProof/>
+        </w:rPr>
+        <w:t xml:space="preserve">                       lw=0.9, color='0.3')</w:t>
+      </w:r>
+    </w:p>
+    <w:p>
+      <w:pPr>
+        <w:spacing w:before="0" w:after="0" w:line="240" w:lineRule="auto"/>
+      </w:pPr>
+      <w:r>
+        <w:rPr>
+          <w:rFonts w:ascii="Consolas" w:hAnsi="Consolas" w:eastAsia="Consolas" w:cs="Consolas"/>
+          <w:sz w:val="15"/>
+          <w:noProof/>
+        </w:rPr>
+        <w:t xml:space="preserve">                if s == 'EV':                 # EV labels must stay below NV on CaF2</w:t>
+      </w:r>
+    </w:p>
+    <w:p>
+      <w:pPr>
+        <w:spacing w:before="0" w:after="0" w:line="240" w:lineRule="auto"/>
+      </w:pPr>
+      <w:r>
+        <w:rPr>
+          <w:rFonts w:ascii="Consolas" w:hAnsi="Consolas" w:eastAsia="Consolas" w:cs="Consolas"/>
+          <w:sz w:val="15"/>
+          <w:noProof/>
+        </w:rPr>
+        <w:t xml:space="preserve">                    fig.canvas.draw()</w:t>
+      </w:r>
+    </w:p>
+    <w:p>
+      <w:pPr>
+        <w:spacing w:before="0" w:after="0" w:line="240" w:lineRule="auto"/>
+      </w:pPr>
+      <w:r>
+        <w:rPr>
+          <w:rFonts w:ascii="Consolas" w:hAnsi="Consolas" w:eastAsia="Consolas" w:cs="Consolas"/>
+          <w:sz w:val="15"/>
+          <w:noProof/>
+        </w:rPr>
+        <w:t xml:space="preserve">                    y1 = h.get_window_extent().transformed(a.transData.inverted()).y1</w:t>
+      </w:r>
+    </w:p>
+    <w:p>
+      <w:pPr>
+        <w:spacing w:before="0" w:after="0" w:line="240" w:lineRule="auto"/>
+      </w:pPr>
+      <w:r>
+        <w:rPr>
+          <w:rFonts w:ascii="Consolas" w:hAnsi="Consolas" w:eastAsia="Consolas" w:cs="Consolas"/>
+          <w:sz w:val="15"/>
+          <w:noProof/>
+        </w:rPr>
+        <w:t xml:space="preserve">                    nc = spec[('NV', 'CaF2')]</w:t>
+      </w:r>
+    </w:p>
+    <w:p>
+      <w:pPr>
+        <w:spacing w:before="0" w:after="0" w:line="240" w:lineRule="auto"/>
+      </w:pPr>
+      <w:r>
+        <w:rPr>
+          <w:rFonts w:ascii="Consolas" w:hAnsi="Consolas" w:eastAsia="Consolas" w:cs="Consolas"/>
+          <w:sz w:val="15"/>
+          <w:noProof/>
+        </w:rPr>
+        <w:t xml:space="preserve">                    k = (nc[:, 0] &gt;= xlab - wl) &amp; (nc[:, 0] &lt;= xlab + wl)</w:t>
+      </w:r>
+    </w:p>
+    <w:p>
+      <w:pPr>
+        <w:spacing w:before="0" w:after="0" w:line="240" w:lineRule="auto"/>
+      </w:pPr>
+      <w:r>
+        <w:rPr>
+          <w:rFonts w:ascii="Consolas" w:hAnsi="Consolas" w:eastAsia="Consolas" w:cs="Consolas"/>
+          <w:sz w:val="15"/>
+          <w:noProof/>
+        </w:rPr>
+        <w:t xml:space="preserve">                    ceiling = nc[k, 1].min() + off[('NV', 'CaF2')] - 0.01 * span</w:t>
+      </w:r>
+    </w:p>
+    <w:p>
+      <w:pPr>
+        <w:spacing w:before="0" w:after="0" w:line="240" w:lineRule="auto"/>
+      </w:pPr>
+      <w:r>
+        <w:rPr>
+          <w:rFonts w:ascii="Consolas" w:hAnsi="Consolas" w:eastAsia="Consolas" w:cs="Consolas"/>
+          <w:sz w:val="15"/>
+          <w:noProof/>
+        </w:rPr>
+        <w:t xml:space="preserve">                    if a is axL and nv_caf_name.x0 - wl &lt;= xlab &lt;= nv_caf_name.x1 + wl:</w:t>
+      </w:r>
+    </w:p>
+    <w:p>
+      <w:pPr>
+        <w:spacing w:before="0" w:after="0" w:line="240" w:lineRule="auto"/>
+      </w:pPr>
+      <w:r>
+        <w:rPr>
+          <w:rFonts w:ascii="Consolas" w:hAnsi="Consolas" w:eastAsia="Consolas" w:cs="Consolas"/>
+          <w:sz w:val="15"/>
+          <w:noProof/>
+        </w:rPr>
+        <w:t xml:space="preserve">                        ceiling = min(ceiling, nv_caf_name.y0 - 0.005 * span)</w:t>
+      </w:r>
+    </w:p>
+    <w:p>
+      <w:pPr>
+        <w:spacing w:before="0" w:after="0" w:line="240" w:lineRule="auto"/>
+      </w:pPr>
+      <w:r>
+        <w:rPr>
+          <w:rFonts w:ascii="Consolas" w:hAnsi="Consolas" w:eastAsia="Consolas" w:cs="Consolas"/>
+          <w:sz w:val="15"/>
+          <w:noProof/>
+        </w:rPr>
+        <w:t xml:space="preserve">                    need = max(need, y1 - ceiling)</w:t>
+      </w:r>
+    </w:p>
+    <w:p>
+      <w:pPr>
+        <w:spacing w:before="0" w:after="0" w:line="240" w:lineRule="auto"/>
+      </w:pPr>
+      <w:r>
+        <w:rPr>
+          <w:rFonts w:ascii="Consolas" w:hAnsi="Consolas" w:eastAsia="Consolas" w:cs="Consolas"/>
+          <w:sz w:val="15"/>
+          <w:noProof/>
+        </w:rPr>
+        <w:t xml:space="preserve">    # 50-count scale bar, top right</w:t>
+      </w:r>
+    </w:p>
+    <w:p>
+      <w:pPr>
+        <w:spacing w:before="0" w:after="0" w:line="240" w:lineRule="auto"/>
+      </w:pPr>
+      <w:r>
+        <w:rPr>
+          <w:rFonts w:ascii="Consolas" w:hAnsi="Consolas" w:eastAsia="Consolas" w:cs="Consolas"/>
+          <w:sz w:val="15"/>
+          <w:noProof/>
+        </w:rPr>
+        <w:t xml:space="preserve">    xb = 3075</w:t>
+      </w:r>
+    </w:p>
+    <w:p>
+      <w:pPr>
+        <w:spacing w:before="0" w:after="0" w:line="240" w:lineRule="auto"/>
+      </w:pPr>
+      <w:r>
+        <w:rPr>
+          <w:rFonts w:ascii="Consolas" w:hAnsi="Consolas" w:eastAsia="Consolas" w:cs="Consolas"/>
+          <w:sz w:val="15"/>
+          <w:noProof/>
+        </w:rPr>
+        <w:t xml:space="preserve">    yb = top + 0.20 * span - 50</w:t>
+      </w:r>
+    </w:p>
+    <w:p>
+      <w:pPr>
+        <w:spacing w:before="0" w:after="0" w:line="240" w:lineRule="auto"/>
+      </w:pPr>
+      <w:r>
+        <w:rPr>
+          <w:rFonts w:ascii="Consolas" w:hAnsi="Consolas" w:eastAsia="Consolas" w:cs="Consolas"/>
+          <w:sz w:val="15"/>
+          <w:noProof/>
+        </w:rPr>
+        <w:t xml:space="preserve">    axR.plot([xb, xb], [yb, yb + 50], color='k', lw=2.0)</w:t>
+      </w:r>
+    </w:p>
+    <w:p>
+      <w:pPr>
+        <w:spacing w:before="0" w:after="0" w:line="240" w:lineRule="auto"/>
+      </w:pPr>
+      <w:r>
+        <w:rPr>
+          <w:rFonts w:ascii="Consolas" w:hAnsi="Consolas" w:eastAsia="Consolas" w:cs="Consolas"/>
+          <w:sz w:val="15"/>
+          <w:noProof/>
+        </w:rPr>
+        <w:t xml:space="preserve">    axR.text(xb - 10, yb + 25, '50\ncounts', ha='right', va='center', fontsize=FS_NAME - 2)</w:t>
+      </w:r>
+    </w:p>
+    <w:p>
+      <w:pPr>
+        <w:spacing w:before="0" w:after="0" w:line="240" w:lineRule="auto"/>
+      </w:pPr>
+      <w:r>
+        <w:rPr>
+          <w:rFonts w:ascii="Consolas" w:hAnsi="Consolas" w:eastAsia="Consolas" w:cs="Consolas"/>
+          <w:sz w:val="15"/>
+          <w:noProof/>
+        </w:rPr>
+        <w:t xml:space="preserve">    dd = 0.012</w:t>
+      </w:r>
+    </w:p>
+    <w:p>
+      <w:pPr>
+        <w:spacing w:before="0" w:after="0" w:line="240" w:lineRule="auto"/>
+      </w:pPr>
+      <w:r>
+        <w:rPr>
+          <w:rFonts w:ascii="Consolas" w:hAnsi="Consolas" w:eastAsia="Consolas" w:cs="Consolas"/>
+          <w:sz w:val="15"/>
+          <w:noProof/>
+        </w:rPr>
+        <w:t xml:space="preserve">    for ax, x0 in [(axL, 1), (axR, 0)]:</w:t>
+      </w:r>
+    </w:p>
+    <w:p>
+      <w:pPr>
+        <w:spacing w:before="0" w:after="0" w:line="240" w:lineRule="auto"/>
+      </w:pPr>
+      <w:r>
+        <w:rPr>
+          <w:rFonts w:ascii="Consolas" w:hAnsi="Consolas" w:eastAsia="Consolas" w:cs="Consolas"/>
+          <w:sz w:val="15"/>
+          <w:noProof/>
+        </w:rPr>
+        <w:t xml:space="preserve">        dx = dd * (HIGH[1] - HIGH[0]) / (LOW[1] - LOW[0]) if ax is axL else dd</w:t>
+      </w:r>
+    </w:p>
+    <w:p>
+      <w:pPr>
+        <w:spacing w:before="0" w:after="0" w:line="240" w:lineRule="auto"/>
+      </w:pPr>
+      <w:r>
+        <w:rPr>
+          <w:rFonts w:ascii="Consolas" w:hAnsi="Consolas" w:eastAsia="Consolas" w:cs="Consolas"/>
+          <w:sz w:val="15"/>
+          <w:noProof/>
+        </w:rPr>
+        <w:t xml:space="preserve">        for y0 in (0, 1):</w:t>
+      </w:r>
+    </w:p>
+    <w:p>
+      <w:pPr>
+        <w:spacing w:before="0" w:after="0" w:line="240" w:lineRule="auto"/>
+      </w:pPr>
+      <w:r>
+        <w:rPr>
+          <w:rFonts w:ascii="Consolas" w:hAnsi="Consolas" w:eastAsia="Consolas" w:cs="Consolas"/>
+          <w:sz w:val="15"/>
+          <w:noProof/>
+        </w:rPr>
+        <w:t xml:space="preserve">            ax.plot((x0 - dx, x0 + dx), (y0 - dd, y0 + dd), transform=ax.transAxes, color='k',</w:t>
+      </w:r>
+    </w:p>
+    <w:p>
+      <w:pPr>
+        <w:spacing w:before="0" w:after="0" w:line="240" w:lineRule="auto"/>
+      </w:pPr>
+      <w:r>
+        <w:rPr>
+          <w:rFonts w:ascii="Consolas" w:hAnsi="Consolas" w:eastAsia="Consolas" w:cs="Consolas"/>
+          <w:sz w:val="15"/>
+          <w:noProof/>
+        </w:rPr>
+        <w:t xml:space="preserve">                    clip_on=False, lw=1.0)</w:t>
+      </w:r>
+    </w:p>
+    <w:p>
+      <w:pPr>
+        <w:spacing w:before="0" w:after="0" w:line="240" w:lineRule="auto"/>
+      </w:pPr>
+      <w:r>
+        <w:rPr>
+          <w:rFonts w:ascii="Consolas" w:hAnsi="Consolas" w:eastAsia="Consolas" w:cs="Consolas"/>
+          <w:sz w:val="15"/>
+          <w:noProof/>
+        </w:rPr>
+        <w:t xml:space="preserve">    return fig, need, off</w:t>
+      </w:r>
+    </w:p>
+    <w:p>
+      <w:pPr>
+        <w:spacing w:before="0" w:after="0" w:line="240" w:lineRule="auto"/>
+      </w:pPr>
+      <w:r>
+        <w:rPr>
+          <w:rFonts w:ascii="Consolas" w:hAnsi="Consolas" w:eastAsia="Consolas" w:cs="Consolas"/>
+          <w:sz w:val="15"/>
+          <w:noProof/>
+        </w:rPr>
+      </w:r>
+    </w:p>
+    <w:p>
+      <w:pPr>
+        <w:spacing w:before="0" w:after="0" w:line="240" w:lineRule="auto"/>
+      </w:pPr>
+      <w:r>
+        <w:rPr>
+          <w:rFonts w:ascii="Consolas" w:hAnsi="Consolas" w:eastAsia="Consolas" w:cs="Consolas"/>
+          <w:sz w:val="15"/>
+          <w:noProof/>
+        </w:rPr>
+      </w:r>
+    </w:p>
+    <w:p>
+      <w:pPr>
+        <w:spacing w:before="0" w:after="0" w:line="240" w:lineRule="auto"/>
+      </w:pPr>
+      <w:r>
+        <w:rPr>
+          <w:rFonts w:ascii="Consolas" w:hAnsi="Consolas" w:eastAsia="Consolas" w:cs="Consolas"/>
+          <w:sz w:val="15"/>
+          <w:noProof/>
+        </w:rPr>
+        <w:t>room = 80.0</w:t>
+      </w:r>
+    </w:p>
+    <w:p>
+      <w:pPr>
+        <w:spacing w:before="0" w:after="0" w:line="240" w:lineRule="auto"/>
+      </w:pPr>
+      <w:r>
+        <w:rPr>
+          <w:rFonts w:ascii="Consolas" w:hAnsi="Consolas" w:eastAsia="Consolas" w:cs="Consolas"/>
+          <w:sz w:val="15"/>
+          <w:noProof/>
+        </w:rPr>
+        <w:t>for _ in range(10):                            # enlarge the space for the EV labels until they fit</w:t>
+      </w:r>
+    </w:p>
+    <w:p>
+      <w:pPr>
+        <w:spacing w:before="0" w:after="0" w:line="240" w:lineRule="auto"/>
+      </w:pPr>
+      <w:r>
+        <w:rPr>
+          <w:rFonts w:ascii="Consolas" w:hAnsi="Consolas" w:eastAsia="Consolas" w:cs="Consolas"/>
+          <w:sz w:val="15"/>
+          <w:noProof/>
+        </w:rPr>
+        <w:t xml:space="preserve">    fig, need, off_one = draw_one(room)</w:t>
+      </w:r>
+    </w:p>
+    <w:p>
+      <w:pPr>
+        <w:spacing w:before="0" w:after="0" w:line="240" w:lineRule="auto"/>
+      </w:pPr>
+      <w:r>
+        <w:rPr>
+          <w:rFonts w:ascii="Consolas" w:hAnsi="Consolas" w:eastAsia="Consolas" w:cs="Consolas"/>
+          <w:sz w:val="15"/>
+          <w:noProof/>
+        </w:rPr>
+        <w:t xml:space="preserve">    if need &lt;= 0:</w:t>
+      </w:r>
+    </w:p>
+    <w:p>
+      <w:pPr>
+        <w:spacing w:before="0" w:after="0" w:line="240" w:lineRule="auto"/>
+      </w:pPr>
+      <w:r>
+        <w:rPr>
+          <w:rFonts w:ascii="Consolas" w:hAnsi="Consolas" w:eastAsia="Consolas" w:cs="Consolas"/>
+          <w:sz w:val="15"/>
+          <w:noProof/>
+        </w:rPr>
+        <w:t xml:space="preserve">        break</w:t>
+      </w:r>
+    </w:p>
+    <w:p>
+      <w:pPr>
+        <w:spacing w:before="0" w:after="0" w:line="240" w:lineRule="auto"/>
+      </w:pPr>
+      <w:r>
+        <w:rPr>
+          <w:rFonts w:ascii="Consolas" w:hAnsi="Consolas" w:eastAsia="Consolas" w:cs="Consolas"/>
+          <w:sz w:val="15"/>
+          <w:noProof/>
+        </w:rPr>
+        <w:t xml:space="preserve">    plt.close(fig)</w:t>
+      </w:r>
+    </w:p>
+    <w:p>
+      <w:pPr>
+        <w:spacing w:before="0" w:after="0" w:line="240" w:lineRule="auto"/>
+      </w:pPr>
+      <w:r>
+        <w:rPr>
+          <w:rFonts w:ascii="Consolas" w:hAnsi="Consolas" w:eastAsia="Consolas" w:cs="Consolas"/>
+          <w:sz w:val="15"/>
+          <w:noProof/>
+        </w:rPr>
+        <w:t xml:space="preserve">    room += need * 1.1 + 5</w:t>
+      </w:r>
+    </w:p>
+    <w:p>
+      <w:pPr>
+        <w:spacing w:before="0" w:after="0" w:line="240" w:lineRule="auto"/>
+      </w:pPr>
+      <w:r>
+        <w:rPr>
+          <w:rFonts w:ascii="Consolas" w:hAnsi="Consolas" w:eastAsia="Consolas" w:cs="Consolas"/>
+          <w:sz w:val="15"/>
+          <w:noProof/>
+        </w:rPr>
+        <w:t>fig.savefig(DATA_DIR / 'CaF2_vs_AgSiNW_OneGraph.png', dpi=600)</w:t>
+      </w:r>
+    </w:p>
+    <w:p>
+      <w:pPr>
+        <w:spacing w:before="0" w:after="0" w:line="240" w:lineRule="auto"/>
+      </w:pPr>
+      <w:r>
+        <w:rPr>
+          <w:rFonts w:ascii="Consolas" w:hAnsi="Consolas" w:eastAsia="Consolas" w:cs="Consolas"/>
+          <w:sz w:val="15"/>
+          <w:noProof/>
+        </w:rPr>
+        <w:t>fig.savefig(DATA_DIR / 'CaF2_vs_AgSiNW_OneGraph.tiff', dpi=600, pil_kwargs={'compression': 'tiff_lzw'})</w:t>
+      </w:r>
+    </w:p>
+    <w:p>
+      <w:pPr>
+        <w:spacing w:before="0" w:after="0" w:line="240" w:lineRule="auto"/>
+      </w:pPr>
+      <w:r>
+        <w:rPr>
+          <w:rFonts w:ascii="Consolas" w:hAnsi="Consolas" w:eastAsia="Consolas" w:cs="Consolas"/>
+          <w:sz w:val="15"/>
+          <w:noProof/>
+        </w:rPr>
+        <w:t>print('One-graph version: vertical shifts (display only): ' +</w:t>
+      </w:r>
+    </w:p>
+    <w:p>
+      <w:pPr>
+        <w:spacing w:before="0" w:after="0" w:line="240" w:lineRule="auto"/>
+      </w:pPr>
+      <w:r>
+        <w:rPr>
+          <w:rFonts w:ascii="Consolas" w:hAnsi="Consolas" w:eastAsia="Consolas" w:cs="Consolas"/>
+          <w:sz w:val="15"/>
+          <w:noProof/>
+        </w:rPr>
+        <w:t xml:space="preserve">      ', '.join(f'{s} on {"CaF2" if sub == "CaF2" else "Ag/SiNWs"} +{off_one[(s, sub)]:.0f}'</w:t>
+      </w:r>
+    </w:p>
+    <w:p>
+      <w:pPr>
+        <w:spacing w:before="0" w:after="0" w:line="240" w:lineRule="auto"/>
+      </w:pPr>
+      <w:r>
+        <w:rPr>
+          <w:rFonts w:ascii="Consolas" w:hAnsi="Consolas" w:eastAsia="Consolas" w:cs="Consolas"/>
+          <w:sz w:val="15"/>
+          <w:noProof/>
+        </w:rPr>
+        <w:t xml:space="preserve">                for s, sub in ORDER))</w:t>
+      </w:r>
+    </w:p>
+    <w:p>
+      <w:pPr>
+        <w:spacing w:before="0" w:after="0" w:line="240" w:lineRule="auto"/>
+      </w:pPr>
+      <w:r>
+        <w:rPr>
+          <w:rFonts w:ascii="Consolas" w:hAnsi="Consolas" w:eastAsia="Consolas" w:cs="Consolas"/>
+          <w:sz w:val="15"/>
+          <w:noProof/>
+        </w:rPr>
       </w:r>
     </w:p>
     <w:p>

</xml_diff>

<commit_message>
Update Word copy of CaF2 vs Ag/SiNW code (SHOW_POSITION switch)
Co-Authored-By: Claude Opus 5.5 <noreply@anthropic.com>
Claude-Session: https://claude.ai/code/session_01L8hQ8e5u5KmaH4dD9snyRw
</commit_message>
<xml_diff>
--- a/CaF2_vs_AgSiNW_Enhancement_Code.docx
+++ b/CaF2_vs_AgSiNW_Enhancement_Code.docx
@@ -681,6 +681,19 @@
           <w:sz w:val="15"/>
           <w:noProof/>
         </w:rPr>
+        <w:t>SHOW_POSITION = False  # True: label '1002  Protein'; False: label 'Protein' only</w:t>
+      </w:r>
+    </w:p>
+    <w:p>
+      <w:pPr>
+        <w:spacing w:before="0" w:after="0" w:line="240" w:lineRule="auto"/>
+      </w:pPr>
+      <w:r>
+        <w:rPr>
+          <w:rFonts w:ascii="Consolas" w:hAnsi="Consolas" w:eastAsia="Consolas" w:cs="Consolas"/>
+          <w:sz w:val="15"/>
+          <w:noProof/>
+        </w:rPr>
         <w:t>GAP = 25              # counts between the top of the CaF2 trace and the bottom of the Ag trace</w:t>
       </w:r>
     </w:p>
@@ -2178,7 +2191,7 @@
           <w:sz w:val="15"/>
           <w:noProof/>
         </w:rPr>
-        <w:t xml:space="preserve">            ax.text(xlab, base, f'{p}  {cls}', rotation=90, ha='center', va='bottom',</w:t>
+        <w:t xml:space="preserve">            ax.text(xlab, base, (f'{p}  {cls}' if SHOW_POSITION else cls), rotation=90, ha='center', va='bottom',</w:t>
       </w:r>
     </w:p>
     <w:p>
@@ -3901,7 +3914,7 @@
           <w:sz w:val="15"/>
           <w:noProof/>
         </w:rPr>
-        <w:t xml:space="preserve">                h = a.text(xlab, base, f'{p}  {cls}', rotation=90, ha='center', va='bottom',</w:t>
+        <w:t xml:space="preserve">                h = a.text(xlab, base, (f'{p}  {cls}' if SHOW_POSITION else cls), rotation=90, ha='center', va='bottom',</w:t>
       </w:r>
     </w:p>
     <w:p>

</xml_diff>

<commit_message>
CaF2 vs Ag/SiNW figure: dotted peak markers only, no label text (LABEL_TEXT switch)
Co-Authored-By: Claude Opus 5.5 <noreply@anthropic.com>
Claude-Session: https://claude.ai/code/session_01L8hQ8e5u5KmaH4dD9snyRw
</commit_message>
<xml_diff>
--- a/CaF2_vs_AgSiNW_Enhancement_Code.docx
+++ b/CaF2_vs_AgSiNW_Enhancement_Code.docx
@@ -681,7 +681,20 @@
           <w:sz w:val="15"/>
           <w:noProof/>
         </w:rPr>
-        <w:t>SHOW_POSITION = False  # True: label '1002  Protein'; False: label 'Protein' only</w:t>
+        <w:t>LABEL_TEXT = 'none'   # 'none': dotted line only; 'name': 'Protein'; 'position+name': '1002  Protein'</w:t>
+      </w:r>
+    </w:p>
+    <w:p>
+      <w:pPr>
+        <w:spacing w:before="0" w:after="0" w:line="240" w:lineRule="auto"/>
+      </w:pPr>
+      <w:r>
+        <w:rPr>
+          <w:rFonts w:ascii="Consolas" w:hAnsi="Consolas" w:eastAsia="Consolas" w:cs="Consolas"/>
+          <w:sz w:val="15"/>
+          <w:noProof/>
+        </w:rPr>
+        <w:t>MARK_LEN = 0.05      # length of the dotted peak marker when LABEL_TEXT = 'none' (fraction of plot height)</w:t>
       </w:r>
     </w:p>
     <w:p>
@@ -1659,7 +1672,7 @@
           <w:sz w:val="15"/>
           <w:noProof/>
         </w:rPr>
-        <w:t>ylim = (lo_all - 0.10 * span, hi_all + 0.40 * span)       # room for the vertical labels</w:t>
+        <w:t>ylim = (lo_all - 0.10 * span, hi_all + (0.40 if LABEL_TEXT != 'none' else 0.15) * span)  # room for labels</w:t>
       </w:r>
     </w:p>
     <w:p>
@@ -2152,6 +2165,84 @@
           <w:sz w:val="15"/>
           <w:noProof/>
         </w:rPr>
+        <w:t xml:space="preserve">        if LABEL_TEXT == 'none':              # dotted marker above each peak, no text</w:t>
+      </w:r>
+    </w:p>
+    <w:p>
+      <w:pPr>
+        <w:spacing w:before="0" w:after="0" w:line="240" w:lineRule="auto"/>
+      </w:pPr>
+      <w:r>
+        <w:rPr>
+          <w:rFonts w:ascii="Consolas" w:hAnsi="Consolas" w:eastAsia="Consolas" w:cs="Consolas"/>
+          <w:sz w:val="15"/>
+          <w:noProof/>
+        </w:rPr>
+        <w:t xml:space="preserve">            for p, _ in sel:</w:t>
+      </w:r>
+    </w:p>
+    <w:p>
+      <w:pPr>
+        <w:spacing w:before="0" w:after="0" w:line="240" w:lineRule="auto"/>
+      </w:pPr>
+      <w:r>
+        <w:rPr>
+          <w:rFonts w:ascii="Consolas" w:hAnsi="Consolas" w:eastAsia="Consolas" w:cs="Consolas"/>
+          <w:sz w:val="15"/>
+          <w:noProof/>
+        </w:rPr>
+        <w:t xml:space="preserve">                y_peak = ag[np.argmin(np.abs(ag[:, 0] - p)), 1] + shift[(s, 'Ag')]</w:t>
+      </w:r>
+    </w:p>
+    <w:p>
+      <w:pPr>
+        <w:spacing w:before="0" w:after="0" w:line="240" w:lineRule="auto"/>
+      </w:pPr>
+      <w:r>
+        <w:rPr>
+          <w:rFonts w:ascii="Consolas" w:hAnsi="Consolas" w:eastAsia="Consolas" w:cs="Consolas"/>
+          <w:sz w:val="15"/>
+          <w:noProof/>
+        </w:rPr>
+        <w:t xml:space="preserve">                ax.plot([p, p], [y_peak + 0.01 * span, y_peak + (0.01 + 2 * MARK_LEN) * span],  # half-height panels</w:t>
+      </w:r>
+    </w:p>
+    <w:p>
+      <w:pPr>
+        <w:spacing w:before="0" w:after="0" w:line="240" w:lineRule="auto"/>
+      </w:pPr>
+      <w:r>
+        <w:rPr>
+          <w:rFonts w:ascii="Consolas" w:hAnsi="Consolas" w:eastAsia="Consolas" w:cs="Consolas"/>
+          <w:sz w:val="15"/>
+          <w:noProof/>
+        </w:rPr>
+        <w:t xml:space="preserve">                        ls=(0, (1, 2)), lw=1.2, color='0.3')</w:t>
+      </w:r>
+    </w:p>
+    <w:p>
+      <w:pPr>
+        <w:spacing w:before="0" w:after="0" w:line="240" w:lineRule="auto"/>
+      </w:pPr>
+      <w:r>
+        <w:rPr>
+          <w:rFonts w:ascii="Consolas" w:hAnsi="Consolas" w:eastAsia="Consolas" w:cs="Consolas"/>
+          <w:sz w:val="15"/>
+          <w:noProof/>
+        </w:rPr>
+        <w:t xml:space="preserve">            continue</w:t>
+      </w:r>
+    </w:p>
+    <w:p>
+      <w:pPr>
+        <w:spacing w:before="0" w:after="0" w:line="240" w:lineRule="auto"/>
+      </w:pPr>
+      <w:r>
+        <w:rPr>
+          <w:rFonts w:ascii="Consolas" w:hAnsi="Consolas" w:eastAsia="Consolas" w:cs="Consolas"/>
+          <w:sz w:val="15"/>
+          <w:noProof/>
+        </w:rPr>
         <w:t xml:space="preserve">        for (p, cls), xlab in zip(sel, xl):</w:t>
       </w:r>
     </w:p>
@@ -2191,7 +2282,7 @@
           <w:sz w:val="15"/>
           <w:noProof/>
         </w:rPr>
-        <w:t xml:space="preserve">            ax.text(xlab, base, (f'{p}  {cls}' if SHOW_POSITION else cls), rotation=90, ha='center', va='bottom',</w:t>
+        <w:t xml:space="preserve">            ax.text(xlab, base, (f'{p}  {cls}' if LABEL_TEXT == 'position+name' else cls), rotation=90, ha='center', va='bottom',</w:t>
       </w:r>
     </w:p>
     <w:p>
@@ -3420,7 +3511,20 @@
           <w:sz w:val="15"/>
           <w:noProof/>
         </w:rPr>
-        <w:t xml:space="preserve">    axL.set_ylim(y_lo - 0.06 * span, top + 0.28 * span)</w:t>
+        <w:t xml:space="preserve">    head = 0.28 if LABEL_TEXT != 'none' else 0.14          # room above the top trace</w:t>
+      </w:r>
+    </w:p>
+    <w:p>
+      <w:pPr>
+        <w:spacing w:before="0" w:after="0" w:line="240" w:lineRule="auto"/>
+      </w:pPr>
+      <w:r>
+        <w:rPr>
+          <w:rFonts w:ascii="Consolas" w:hAnsi="Consolas" w:eastAsia="Consolas" w:cs="Consolas"/>
+          <w:sz w:val="15"/>
+          <w:noProof/>
+        </w:rPr>
+        <w:t xml:space="preserve">    axL.set_ylim(y_lo - 0.06 * span, top + head * span)</w:t>
       </w:r>
     </w:p>
     <w:p>
@@ -3888,6 +3992,123 @@
           <w:sz w:val="15"/>
           <w:noProof/>
         </w:rPr>
+        <w:t xml:space="preserve">                if LABEL_TEXT == 'none':          # dotted marker above each peak, no text</w:t>
+      </w:r>
+    </w:p>
+    <w:p>
+      <w:pPr>
+        <w:spacing w:before="0" w:after="0" w:line="240" w:lineRule="auto"/>
+      </w:pPr>
+      <w:r>
+        <w:rPr>
+          <w:rFonts w:ascii="Consolas" w:hAnsi="Consolas" w:eastAsia="Consolas" w:cs="Consolas"/>
+          <w:sz w:val="15"/>
+          <w:noProof/>
+        </w:rPr>
+        <w:t xml:space="preserve">                    y_peak = ag[np.argmin(np.abs(ag[:, 0] - p)), 1] + o</w:t>
+      </w:r>
+    </w:p>
+    <w:p>
+      <w:pPr>
+        <w:spacing w:before="0" w:after="0" w:line="240" w:lineRule="auto"/>
+      </w:pPr>
+      <w:r>
+        <w:rPr>
+          <w:rFonts w:ascii="Consolas" w:hAnsi="Consolas" w:eastAsia="Consolas" w:cs="Consolas"/>
+          <w:sz w:val="15"/>
+          <w:noProof/>
+        </w:rPr>
+        <w:t xml:space="preserve">                    y_top = y_peak + (0.005 + MARK_LEN) * span</w:t>
+      </w:r>
+    </w:p>
+    <w:p>
+      <w:pPr>
+        <w:spacing w:before="0" w:after="0" w:line="240" w:lineRule="auto"/>
+      </w:pPr>
+      <w:r>
+        <w:rPr>
+          <w:rFonts w:ascii="Consolas" w:hAnsi="Consolas" w:eastAsia="Consolas" w:cs="Consolas"/>
+          <w:sz w:val="15"/>
+          <w:noProof/>
+        </w:rPr>
+        <w:t xml:space="preserve">                    a.plot([p, p], [y_peak + 0.005 * span, y_top], ls=(0, (1, 2)), lw=1.2, color='0.3')</w:t>
+      </w:r>
+    </w:p>
+    <w:p>
+      <w:pPr>
+        <w:spacing w:before="0" w:after="0" w:line="240" w:lineRule="auto"/>
+      </w:pPr>
+      <w:r>
+        <w:rPr>
+          <w:rFonts w:ascii="Consolas" w:hAnsi="Consolas" w:eastAsia="Consolas" w:cs="Consolas"/>
+          <w:sz w:val="15"/>
+          <w:noProof/>
+        </w:rPr>
+        <w:t xml:space="preserve">                    if s == 'EV':</w:t>
+      </w:r>
+    </w:p>
+    <w:p>
+      <w:pPr>
+        <w:spacing w:before="0" w:after="0" w:line="240" w:lineRule="auto"/>
+      </w:pPr>
+      <w:r>
+        <w:rPr>
+          <w:rFonts w:ascii="Consolas" w:hAnsi="Consolas" w:eastAsia="Consolas" w:cs="Consolas"/>
+          <w:sz w:val="15"/>
+          <w:noProof/>
+        </w:rPr>
+        <w:t xml:space="preserve">                        nc = spec[('NV', 'CaF2')]</w:t>
+      </w:r>
+    </w:p>
+    <w:p>
+      <w:pPr>
+        <w:spacing w:before="0" w:after="0" w:line="240" w:lineRule="auto"/>
+      </w:pPr>
+      <w:r>
+        <w:rPr>
+          <w:rFonts w:ascii="Consolas" w:hAnsi="Consolas" w:eastAsia="Consolas" w:cs="Consolas"/>
+          <w:sz w:val="15"/>
+          <w:noProof/>
+        </w:rPr>
+        <w:t xml:space="preserve">                        k = (nc[:, 0] &gt;= p - wl) &amp; (nc[:, 0] &lt;= p + wl)</w:t>
+      </w:r>
+    </w:p>
+    <w:p>
+      <w:pPr>
+        <w:spacing w:before="0" w:after="0" w:line="240" w:lineRule="auto"/>
+      </w:pPr>
+      <w:r>
+        <w:rPr>
+          <w:rFonts w:ascii="Consolas" w:hAnsi="Consolas" w:eastAsia="Consolas" w:cs="Consolas"/>
+          <w:sz w:val="15"/>
+          <w:noProof/>
+        </w:rPr>
+        <w:t xml:space="preserve">                        need = max(need, y_top - (nc[k, 1].min() + off[('NV', 'CaF2')] - 0.01 * span))</w:t>
+      </w:r>
+    </w:p>
+    <w:p>
+      <w:pPr>
+        <w:spacing w:before="0" w:after="0" w:line="240" w:lineRule="auto"/>
+      </w:pPr>
+      <w:r>
+        <w:rPr>
+          <w:rFonts w:ascii="Consolas" w:hAnsi="Consolas" w:eastAsia="Consolas" w:cs="Consolas"/>
+          <w:sz w:val="15"/>
+          <w:noProof/>
+        </w:rPr>
+        <w:t xml:space="preserve">                    continue</w:t>
+      </w:r>
+    </w:p>
+    <w:p>
+      <w:pPr>
+        <w:spacing w:before="0" w:after="0" w:line="240" w:lineRule="auto"/>
+      </w:pPr>
+      <w:r>
+        <w:rPr>
+          <w:rFonts w:ascii="Consolas" w:hAnsi="Consolas" w:eastAsia="Consolas" w:cs="Consolas"/>
+          <w:sz w:val="15"/>
+          <w:noProof/>
+        </w:rPr>
         <w:t xml:space="preserve">                near = (ag[:, 0] &gt;= min(p, xlab) - wl) &amp; (ag[:, 0] &lt;= max(p, xlab) + wl)</w:t>
       </w:r>
     </w:p>
@@ -3914,7 +4135,7 @@
           <w:sz w:val="15"/>
           <w:noProof/>
         </w:rPr>
-        <w:t xml:space="preserve">                h = a.text(xlab, base, (f'{p}  {cls}' if SHOW_POSITION else cls), rotation=90, ha='center', va='bottom',</w:t>
+        <w:t xml:space="preserve">                h = a.text(xlab, base, (f'{p}  {cls}' if LABEL_TEXT == 'position+name' else cls), rotation=90, ha='center', va='bottom',</w:t>
       </w:r>
     </w:p>
     <w:p>
@@ -4122,7 +4343,7 @@
           <w:sz w:val="15"/>
           <w:noProof/>
         </w:rPr>
-        <w:t xml:space="preserve">    yb = top + 0.20 * span - 50</w:t>
+        <w:t xml:space="preserve">    yb = top + (head - 0.08) * span - 50</w:t>
       </w:r>
     </w:p>
     <w:p>
@@ -4276,7 +4497,7 @@
           <w:sz w:val="15"/>
           <w:noProof/>
         </w:rPr>
-        <w:t>room = 80.0</w:t>
+        <w:t>room = 80.0 if LABEL_TEXT != 'none' else float(GAP)</w:t>
       </w:r>
     </w:p>
     <w:p>

</xml_diff>

<commit_message>
CaF2 vs Ag/SiNW figure: remove dotted peak markers (PEAK_MARKERS switch, off)
Co-Authored-By: Claude Opus 5.5 <noreply@anthropic.com>
Claude-Session: https://claude.ai/code/session_01L8hQ8e5u5KmaH4dD9snyRw
</commit_message>
<xml_diff>
--- a/CaF2_vs_AgSiNW_Enhancement_Code.docx
+++ b/CaF2_vs_AgSiNW_Enhancement_Code.docx
@@ -707,6 +707,19 @@
           <w:sz w:val="15"/>
           <w:noProof/>
         </w:rPr>
+        <w:t>PEAK_MARKERS = False  # True: dotted line above each peak (when LABEL_TEXT = 'none'); False: plain spectra</w:t>
+      </w:r>
+    </w:p>
+    <w:p>
+      <w:pPr>
+        <w:spacing w:before="0" w:after="0" w:line="240" w:lineRule="auto"/>
+      </w:pPr>
+      <w:r>
+        <w:rPr>
+          <w:rFonts w:ascii="Consolas" w:hAnsi="Consolas" w:eastAsia="Consolas" w:cs="Consolas"/>
+          <w:sz w:val="15"/>
+          <w:noProof/>
+        </w:rPr>
         <w:t>GAP = 25              # counts between the top of the CaF2 trace and the bottom of the Ag trace</w:t>
       </w:r>
     </w:p>
@@ -2280,20 +2293,33 @@
           <w:sz w:val="15"/>
           <w:noProof/>
         </w:rPr>
-        <w:t xml:space="preserve">                ax.plot([p, p], [y_peak + 0.01 * span, y_peak + (0.01 + 2 * MARK_LEN) * span],  # half-height panels</w:t>
-      </w:r>
-    </w:p>
-    <w:p>
-      <w:pPr>
-        <w:spacing w:before="0" w:after="0" w:line="240" w:lineRule="auto"/>
-      </w:pPr>
-      <w:r>
-        <w:rPr>
-          <w:rFonts w:ascii="Consolas" w:hAnsi="Consolas" w:eastAsia="Consolas" w:cs="Consolas"/>
-          <w:sz w:val="15"/>
-          <w:noProof/>
-        </w:rPr>
-        <w:t xml:space="preserve">                        ls=(0, (1, 2)), lw=1.2, color='0.3')</w:t>
+        <w:t xml:space="preserve">                if PEAK_MARKERS:</w:t>
+      </w:r>
+    </w:p>
+    <w:p>
+      <w:pPr>
+        <w:spacing w:before="0" w:after="0" w:line="240" w:lineRule="auto"/>
+      </w:pPr>
+      <w:r>
+        <w:rPr>
+          <w:rFonts w:ascii="Consolas" w:hAnsi="Consolas" w:eastAsia="Consolas" w:cs="Consolas"/>
+          <w:sz w:val="15"/>
+          <w:noProof/>
+        </w:rPr>
+        <w:t xml:space="preserve">                    ax.plot([p, p], [y_peak + 0.01 * span, y_peak + (0.01 + 2 * MARK_LEN) * span],  # half-height panels</w:t>
+      </w:r>
+    </w:p>
+    <w:p>
+      <w:pPr>
+        <w:spacing w:before="0" w:after="0" w:line="240" w:lineRule="auto"/>
+      </w:pPr>
+      <w:r>
+        <w:rPr>
+          <w:rFonts w:ascii="Consolas" w:hAnsi="Consolas" w:eastAsia="Consolas" w:cs="Consolas"/>
+          <w:sz w:val="15"/>
+          <w:noProof/>
+        </w:rPr>
+        <w:t xml:space="preserve">                            ls=(0, (1, 2)), lw=1.2, color='0.3')</w:t>
       </w:r>
     </w:p>
     <w:p>
@@ -4094,20 +4120,33 @@
           <w:sz w:val="15"/>
           <w:noProof/>
         </w:rPr>
-        <w:t xml:space="preserve">                    y_top = y_peak + (0.005 + MARK_LEN) * span</w:t>
-      </w:r>
-    </w:p>
-    <w:p>
-      <w:pPr>
-        <w:spacing w:before="0" w:after="0" w:line="240" w:lineRule="auto"/>
-      </w:pPr>
-      <w:r>
-        <w:rPr>
-          <w:rFonts w:ascii="Consolas" w:hAnsi="Consolas" w:eastAsia="Consolas" w:cs="Consolas"/>
-          <w:sz w:val="15"/>
-          <w:noProof/>
-        </w:rPr>
-        <w:t xml:space="preserve">                    a.plot([p, p], [y_peak + 0.005 * span, y_top], ls=(0, (1, 2)), lw=1.2, color='0.3')</w:t>
+        <w:t xml:space="preserve">                    y_top = y_peak + (0.005 + MARK_LEN) * span if PEAK_MARKERS else y_peak</w:t>
+      </w:r>
+    </w:p>
+    <w:p>
+      <w:pPr>
+        <w:spacing w:before="0" w:after="0" w:line="240" w:lineRule="auto"/>
+      </w:pPr>
+      <w:r>
+        <w:rPr>
+          <w:rFonts w:ascii="Consolas" w:hAnsi="Consolas" w:eastAsia="Consolas" w:cs="Consolas"/>
+          <w:sz w:val="15"/>
+          <w:noProof/>
+        </w:rPr>
+        <w:t xml:space="preserve">                    if PEAK_MARKERS:</w:t>
+      </w:r>
+    </w:p>
+    <w:p>
+      <w:pPr>
+        <w:spacing w:before="0" w:after="0" w:line="240" w:lineRule="auto"/>
+      </w:pPr>
+      <w:r>
+        <w:rPr>
+          <w:rFonts w:ascii="Consolas" w:hAnsi="Consolas" w:eastAsia="Consolas" w:cs="Consolas"/>
+          <w:sz w:val="15"/>
+          <w:noProof/>
+        </w:rPr>
+        <w:t xml:space="preserve">                        a.plot([p, p], [y_peak + 0.005 * span, y_top], ls=(0, (1, 2)), lw=1.2, color='0.3')</w:t>
       </w:r>
     </w:p>
     <w:p>

</xml_diff>

<commit_message>
CaF2 vs Ag/SiNW figures: same size and fonts as Fig 2b (6.5 in wide; ticks 10, axis 13, text 10 pt)
Co-Authored-By: Claude Opus 5.5 <noreply@anthropic.com>
Claude-Session: https://claude.ai/code/session_01L8hQ8e5u5KmaH4dD9snyRw
</commit_message>
<xml_diff>
--- a/CaF2_vs_AgSiNW_Enhancement_Code.docx
+++ b/CaF2_vs_AgSiNW_Enhancement_Code.docx
@@ -668,7 +668,7 @@
           <w:sz w:val="15"/>
           <w:noProof/>
         </w:rPr>
-        <w:t>FS_LABEL, FS_NAME, FS_AXIS, FS_TICK, FS_PANEL = 12, 14, 17, 15, 18</w:t>
+        <w:t>FS_LABEL, FS_NAME, FS_AXIS, FS_TICK, FS_PANEL = 10, 10, 13, 10, 13   # same as Fig 2b (6.5 in wide)</w:t>
       </w:r>
     </w:p>
     <w:p>
@@ -1786,7 +1786,7 @@
           <w:sz w:val="15"/>
           <w:noProof/>
         </w:rPr>
-        <w:t>fig = plt.figure(figsize=(11, 13))</w:t>
+        <w:t>fig = plt.figure(figsize=(6.5, 7.7))</w:t>
       </w:r>
     </w:p>
     <w:p>
@@ -1929,7 +1929,7 @@
           <w:sz w:val="15"/>
           <w:noProof/>
         </w:rPr>
-        <w:t xml:space="preserve">            ax.plot(d[m, 0], d[m, 1] + shift[(s, sub)], color=col, lw=0.8)</w:t>
+        <w:t xml:space="preserve">            ax.plot(d[m, 0], d[m, 1] + shift[(s, sub)], color=col, lw=0.5)</w:t>
       </w:r>
     </w:p>
     <w:p>
@@ -1955,7 +1955,7 @@
           <w:sz w:val="15"/>
           <w:noProof/>
         </w:rPr>
-        <w:t xml:space="preserve">        ax.tick_params(direction='in', length=6, width=1.0, labelsize=FS_TICK)</w:t>
+        <w:t xml:space="preserve">        ax.tick_params(direction='in', length=5, labelsize=FS_TICK)</w:t>
       </w:r>
     </w:p>
     <w:p>
@@ -2514,7 +2514,7 @@
           <w:sz w:val="15"/>
           <w:noProof/>
         </w:rPr>
-        <w:t xml:space="preserve">        axL.text(415, d[m, 1].min() + shift[(s, sub)] - 0.012 * span, txt, color=col,</w:t>
+        <w:t xml:space="preserve">        axL.text(425, d[m, 1].min() + shift[(s, sub)] - 0.012 * span, txt, color=col,</w:t>
       </w:r>
     </w:p>
     <w:p>
@@ -2553,7 +2553,7 @@
           <w:sz w:val="15"/>
           <w:noProof/>
         </w:rPr>
-        <w:t xml:space="preserve">    xb = 3075</w:t>
+        <w:t xml:space="preserve">    xb = 3065</w:t>
       </w:r>
     </w:p>
     <w:p>
@@ -2579,20 +2579,20 @@
           <w:sz w:val="15"/>
           <w:noProof/>
         </w:rPr>
-        <w:t xml:space="preserve">    axR.plot([xb, xb], [yb, yb + 50], color='k', lw=2.0)</w:t>
-      </w:r>
-    </w:p>
-    <w:p>
-      <w:pPr>
-        <w:spacing w:before="0" w:after="0" w:line="240" w:lineRule="auto"/>
-      </w:pPr>
-      <w:r>
-        <w:rPr>
-          <w:rFonts w:ascii="Consolas" w:hAnsi="Consolas" w:eastAsia="Consolas" w:cs="Consolas"/>
-          <w:sz w:val="15"/>
-          <w:noProof/>
-        </w:rPr>
-        <w:t xml:space="preserve">    axR.text(xb - 10, yb + 25, '50\ncounts', ha='right', va='center', fontsize=FS_NAME - 2)</w:t>
+        <w:t xml:space="preserve">    axR.plot([xb, xb], [yb, yb + 50], color='k', lw=1.5)</w:t>
+      </w:r>
+    </w:p>
+    <w:p>
+      <w:pPr>
+        <w:spacing w:before="0" w:after="0" w:line="240" w:lineRule="auto"/>
+      </w:pPr>
+      <w:r>
+        <w:rPr>
+          <w:rFonts w:ascii="Consolas" w:hAnsi="Consolas" w:eastAsia="Consolas" w:cs="Consolas"/>
+          <w:sz w:val="15"/>
+          <w:noProof/>
+        </w:rPr>
+        <w:t xml:space="preserve">    axR.text(xb - 10, yb + 25, '50\ncounts', ha='right', va='center', fontsize=FS_NAME - 1)</w:t>
       </w:r>
     </w:p>
     <w:p>
@@ -2826,7 +2826,7 @@
           <w:sz w:val="15"/>
           <w:noProof/>
         </w:rPr>
-        <w:t xml:space="preserve">    axL.text(-0.07, 1.0, f'({"ab"[row]})', transform=axL.transAxes, fontsize=FS_PANEL,</w:t>
+        <w:t xml:space="preserve">    axL.text(-0.10, 1.0, f'({"ab"[row]})', transform=axL.transAxes, fontsize=FS_PANEL,</w:t>
       </w:r>
     </w:p>
     <w:p>
@@ -2852,20 +2852,20 @@
           <w:sz w:val="15"/>
           <w:noProof/>
         </w:rPr>
-        <w:t>fig.text(0.53, 0.02, 'Raman Shift (cm$^{-1}$)', ha='center', fontsize=FS_AXIS)</w:t>
-      </w:r>
-    </w:p>
-    <w:p>
-      <w:pPr>
-        <w:spacing w:before="0" w:after="0" w:line="240" w:lineRule="auto"/>
-      </w:pPr>
-      <w:r>
-        <w:rPr>
-          <w:rFonts w:ascii="Consolas" w:hAnsi="Consolas" w:eastAsia="Consolas" w:cs="Consolas"/>
-          <w:sz w:val="15"/>
-          <w:noProof/>
-        </w:rPr>
-        <w:t>fig.subplots_adjust(left=0.08, right=0.98, bottom=0.06, top=0.99)</w:t>
+        <w:t>fig.text(0.54, 0.012, 'Raman Shift (cm$^{-1}$)', ha='center', fontsize=FS_AXIS)</w:t>
+      </w:r>
+    </w:p>
+    <w:p>
+      <w:pPr>
+        <w:spacing w:before="0" w:after="0" w:line="240" w:lineRule="auto"/>
+      </w:pPr>
+      <w:r>
+        <w:rPr>
+          <w:rFonts w:ascii="Consolas" w:hAnsi="Consolas" w:eastAsia="Consolas" w:cs="Consolas"/>
+          <w:sz w:val="15"/>
+          <w:noProof/>
+        </w:rPr>
+        <w:t>fig.subplots_adjust(left=0.10, right=0.98, bottom=0.075, top=0.98)</w:t>
       </w:r>
     </w:p>
     <w:p>
@@ -3574,7 +3574,7 @@
           <w:sz w:val="15"/>
           <w:noProof/>
         </w:rPr>
-        <w:t xml:space="preserve">    fig, (axL, axR) = plt.subplots(1, 2, sharey=True, figsize=(11, 12),</w:t>
+        <w:t xml:space="preserve">    fig, (axL, axR) = plt.subplots(1, 2, sharey=True, figsize=(6.5, 7.1),</w:t>
       </w:r>
     </w:p>
     <w:p>
@@ -3704,7 +3704,7 @@
           <w:sz w:val="15"/>
           <w:noProof/>
         </w:rPr>
-        <w:t xml:space="preserve">                    lw=0.8)</w:t>
+        <w:t xml:space="preserve">                    lw=0.5)</w:t>
       </w:r>
     </w:p>
     <w:p>
@@ -3730,7 +3730,7 @@
           <w:sz w:val="15"/>
           <w:noProof/>
         </w:rPr>
-        <w:t xml:space="preserve">        ax.tick_params(direction='in', length=6, width=1.0, labelsize=FS_TICK)</w:t>
+        <w:t xml:space="preserve">        ax.tick_params(direction='in', length=5, labelsize=FS_TICK)</w:t>
       </w:r>
     </w:p>
     <w:p>
@@ -3951,7 +3951,7 @@
           <w:sz w:val="15"/>
           <w:noProof/>
         </w:rPr>
-        <w:t xml:space="preserve">        t = axL.text(415, d[m, 1].min() + off[(s, sub)] - 0.008 * span, txt,</w:t>
+        <w:t xml:space="preserve">        t = axL.text(425, d[m, 1].min() + off[(s, sub)] - 0.008 * span, txt,</w:t>
       </w:r>
     </w:p>
     <w:p>
@@ -4445,7 +4445,7 @@
           <w:sz w:val="15"/>
           <w:noProof/>
         </w:rPr>
-        <w:t xml:space="preserve">    xb = 3075</w:t>
+        <w:t xml:space="preserve">    xb = 3065</w:t>
       </w:r>
     </w:p>
     <w:p>
@@ -4471,20 +4471,20 @@
           <w:sz w:val="15"/>
           <w:noProof/>
         </w:rPr>
-        <w:t xml:space="preserve">    axR.plot([xb, xb], [yb, yb + 50], color='k', lw=2.0)</w:t>
-      </w:r>
-    </w:p>
-    <w:p>
-      <w:pPr>
-        <w:spacing w:before="0" w:after="0" w:line="240" w:lineRule="auto"/>
-      </w:pPr>
-      <w:r>
-        <w:rPr>
-          <w:rFonts w:ascii="Consolas" w:hAnsi="Consolas" w:eastAsia="Consolas" w:cs="Consolas"/>
-          <w:sz w:val="15"/>
-          <w:noProof/>
-        </w:rPr>
-        <w:t xml:space="preserve">    axR.text(xb - 10, yb + 25, '50\ncounts', ha='right', va='center', fontsize=FS_NAME - 2)</w:t>
+        <w:t xml:space="preserve">    axR.plot([xb, xb], [yb, yb + 50], color='k', lw=1.5)</w:t>
+      </w:r>
+    </w:p>
+    <w:p>
+      <w:pPr>
+        <w:spacing w:before="0" w:after="0" w:line="240" w:lineRule="auto"/>
+      </w:pPr>
+      <w:r>
+        <w:rPr>
+          <w:rFonts w:ascii="Consolas" w:hAnsi="Consolas" w:eastAsia="Consolas" w:cs="Consolas"/>
+          <w:sz w:val="15"/>
+          <w:noProof/>
+        </w:rPr>
+        <w:t xml:space="preserve">    axR.text(xb - 10, yb + 25, '50\ncounts', ha='right', va='center', fontsize=FS_NAME - 1)</w:t>
       </w:r>
     </w:p>
     <w:p>

</xml_diff>

<commit_message>
CaF2 vs Ag/SiNW figures: Fig 2a size (8.5 x 6.5 in), fonts and colours; CaF2 traces in light sample colours
Co-Authored-By: Claude Opus 5.5 <noreply@anthropic.com>
Claude-Session: https://claude.ai/code/session_01L8hQ8e5u5KmaH4dD9snyRw
</commit_message>
<xml_diff>
--- a/CaF2_vs_AgSiNW_Enhancement_Code.docx
+++ b/CaF2_vs_AgSiNW_Enhancement_Code.docx
@@ -642,6 +642,32 @@
           <w:sz w:val="15"/>
           <w:noProof/>
         </w:rPr>
+        <w:t>CAF2_COL = {'EV': '#85ACBE', 'NV': '#DAA98D'}   # CaF2 traces: light shade of the sample colour (50 % white)</w:t>
+      </w:r>
+    </w:p>
+    <w:p>
+      <w:pPr>
+        <w:spacing w:before="0" w:after="0" w:line="240" w:lineRule="auto"/>
+      </w:pPr>
+      <w:r>
+        <w:rPr>
+          <w:rFonts w:ascii="Consolas" w:hAnsi="Consolas" w:eastAsia="Consolas" w:cs="Consolas"/>
+          <w:sz w:val="15"/>
+          <w:noProof/>
+        </w:rPr>
+        <w:t>#           (use {'EV': COL['CaF2'], 'NV': COL['CaF2']} for grey CaF2 traces)</w:t>
+      </w:r>
+    </w:p>
+    <w:p>
+      <w:pPr>
+        <w:spacing w:before="0" w:after="0" w:line="240" w:lineRule="auto"/>
+      </w:pPr>
+      <w:r>
+        <w:rPr>
+          <w:rFonts w:ascii="Consolas" w:hAnsi="Consolas" w:eastAsia="Consolas" w:cs="Consolas"/>
+          <w:sz w:val="15"/>
+          <w:noProof/>
+        </w:rPr>
         <w:t>NAME = {'EV': 'EV Acacia', 'NV': 'Nanovesicles Acacia'}</w:t>
       </w:r>
     </w:p>
@@ -668,7 +694,7 @@
           <w:sz w:val="15"/>
           <w:noProof/>
         </w:rPr>
-        <w:t>FS_LABEL, FS_NAME, FS_AXIS, FS_TICK, FS_PANEL = 10, 10, 13, 10, 13   # same as Fig 2b (6.5 in wide)</w:t>
+        <w:t>FS_LABEL, FS_NAME, FS_AXIS, FS_TICK, FS_PANEL = 10, 10, 13, 10, 13   # same as Fig 2a/2b</w:t>
       </w:r>
     </w:p>
     <w:p>
@@ -1786,7 +1812,7 @@
           <w:sz w:val="15"/>
           <w:noProof/>
         </w:rPr>
-        <w:t>fig = plt.figure(figsize=(6.5, 7.7))</w:t>
+        <w:t>fig = plt.figure(figsize=(8.5, 8.0))</w:t>
       </w:r>
     </w:p>
     <w:p>
@@ -1890,7 +1916,7 @@
           <w:sz w:val="15"/>
           <w:noProof/>
         </w:rPr>
-        <w:t xml:space="preserve">        for sub, col in [('CaF2', COL['CaF2']), ('Ag', COL[s])]:</w:t>
+        <w:t xml:space="preserve">        for sub, col in [('CaF2', CAF2_COL[s]), ('Ag', COL[s])]:</w:t>
       </w:r>
     </w:p>
     <w:p>
@@ -1929,7 +1955,7 @@
           <w:sz w:val="15"/>
           <w:noProof/>
         </w:rPr>
-        <w:t xml:space="preserve">            ax.plot(d[m, 0], d[m, 1] + shift[(s, sub)], color=col, lw=0.5)</w:t>
+        <w:t xml:space="preserve">            ax.plot(d[m, 0], d[m, 1] + shift[(s, sub)], color=col, lw=0.6)</w:t>
       </w:r>
     </w:p>
     <w:p>
@@ -2475,7 +2501,7 @@
           <w:sz w:val="15"/>
           <w:noProof/>
         </w:rPr>
-        <w:t xml:space="preserve">                          ('CaF2', COL['CaF2'], f'{NAME[s]} on CaF$_2$')]:</w:t>
+        <w:t xml:space="preserve">                          ('CaF2', COL[s], f'{NAME[s]} on CaF$_2$')]:</w:t>
       </w:r>
     </w:p>
     <w:p>
@@ -2813,20 +2839,20 @@
           <w:sz w:val="15"/>
           <w:noProof/>
         </w:rPr>
-        <w:t xml:space="preserve">    axL.set_ylabel('Raman Intensity (a.u.)', fontsize=FS_AXIS)</w:t>
-      </w:r>
-    </w:p>
-    <w:p>
-      <w:pPr>
-        <w:spacing w:before="0" w:after="0" w:line="240" w:lineRule="auto"/>
-      </w:pPr>
-      <w:r>
-        <w:rPr>
-          <w:rFonts w:ascii="Consolas" w:hAnsi="Consolas" w:eastAsia="Consolas" w:cs="Consolas"/>
-          <w:sz w:val="15"/>
-          <w:noProof/>
-        </w:rPr>
-        <w:t xml:space="preserve">    axL.text(-0.10, 1.0, f'({"ab"[row]})', transform=axL.transAxes, fontsize=FS_PANEL,</w:t>
+        <w:t xml:space="preserve">    axL.set_ylabel('Intensity (a.u.)', fontsize=FS_AXIS)</w:t>
+      </w:r>
+    </w:p>
+    <w:p>
+      <w:pPr>
+        <w:spacing w:before="0" w:after="0" w:line="240" w:lineRule="auto"/>
+      </w:pPr>
+      <w:r>
+        <w:rPr>
+          <w:rFonts w:ascii="Consolas" w:hAnsi="Consolas" w:eastAsia="Consolas" w:cs="Consolas"/>
+          <w:sz w:val="15"/>
+          <w:noProof/>
+        </w:rPr>
+        <w:t xml:space="preserve">    axL.text(-0.075, 1.0, f'({"ab"[row]})', transform=axL.transAxes, fontsize=FS_PANEL,</w:t>
       </w:r>
     </w:p>
     <w:p>
@@ -2852,20 +2878,20 @@
           <w:sz w:val="15"/>
           <w:noProof/>
         </w:rPr>
-        <w:t>fig.text(0.54, 0.012, 'Raman Shift (cm$^{-1}$)', ha='center', fontsize=FS_AXIS)</w:t>
-      </w:r>
-    </w:p>
-    <w:p>
-      <w:pPr>
-        <w:spacing w:before="0" w:after="0" w:line="240" w:lineRule="auto"/>
-      </w:pPr>
-      <w:r>
-        <w:rPr>
-          <w:rFonts w:ascii="Consolas" w:hAnsi="Consolas" w:eastAsia="Consolas" w:cs="Consolas"/>
-          <w:sz w:val="15"/>
-          <w:noProof/>
-        </w:rPr>
-        <w:t>fig.subplots_adjust(left=0.10, right=0.98, bottom=0.075, top=0.98)</w:t>
+        <w:t>fig.text(0.53, 0.012, 'Raman Shift (cm$^{-1}$)', ha='center', fontsize=FS_AXIS)</w:t>
+      </w:r>
+    </w:p>
+    <w:p>
+      <w:pPr>
+        <w:spacing w:before="0" w:after="0" w:line="240" w:lineRule="auto"/>
+      </w:pPr>
+      <w:r>
+        <w:rPr>
+          <w:rFonts w:ascii="Consolas" w:hAnsi="Consolas" w:eastAsia="Consolas" w:cs="Consolas"/>
+          <w:sz w:val="15"/>
+          <w:noProof/>
+        </w:rPr>
+        <w:t>fig.subplots_adjust(left=0.08, right=0.98, bottom=0.075, top=0.98)</w:t>
       </w:r>
     </w:p>
     <w:p>
@@ -3574,7 +3600,7 @@
           <w:sz w:val="15"/>
           <w:noProof/>
         </w:rPr>
-        <w:t xml:space="preserve">    fig, (axL, axR) = plt.subplots(1, 2, sharey=True, figsize=(6.5, 7.1),</w:t>
+        <w:t xml:space="preserve">    fig, (axL, axR) = plt.subplots(1, 2, sharey=True, figsize=(8.5, 6.5),</w:t>
       </w:r>
     </w:p>
     <w:p>
@@ -3691,20 +3717,20 @@
           <w:sz w:val="15"/>
           <w:noProof/>
         </w:rPr>
-        <w:t xml:space="preserve">            ax.plot(d[m, 0], d[m, 1] + off[(s, sub)], color=COL['CaF2'] if sub == 'CaF2' else COL[s],</w:t>
-      </w:r>
-    </w:p>
-    <w:p>
-      <w:pPr>
-        <w:spacing w:before="0" w:after="0" w:line="240" w:lineRule="auto"/>
-      </w:pPr>
-      <w:r>
-        <w:rPr>
-          <w:rFonts w:ascii="Consolas" w:hAnsi="Consolas" w:eastAsia="Consolas" w:cs="Consolas"/>
-          <w:sz w:val="15"/>
-          <w:noProof/>
-        </w:rPr>
-        <w:t xml:space="preserve">                    lw=0.5)</w:t>
+        <w:t xml:space="preserve">            ax.plot(d[m, 0], d[m, 1] + off[(s, sub)], color=CAF2_COL[s] if sub == 'CaF2' else COL[s],</w:t>
+      </w:r>
+    </w:p>
+    <w:p>
+      <w:pPr>
+        <w:spacing w:before="0" w:after="0" w:line="240" w:lineRule="auto"/>
+      </w:pPr>
+      <w:r>
+        <w:rPr>
+          <w:rFonts w:ascii="Consolas" w:hAnsi="Consolas" w:eastAsia="Consolas" w:cs="Consolas"/>
+          <w:sz w:val="15"/>
+          <w:noProof/>
+        </w:rPr>
+        <w:t xml:space="preserve">                    lw=0.6)</w:t>
       </w:r>
     </w:p>
     <w:p>
@@ -3821,33 +3847,33 @@
           <w:sz w:val="15"/>
           <w:noProof/>
         </w:rPr>
-        <w:t xml:space="preserve">    axL.set_ylabel('Raman Intensity (a.u.)', fontsize=FS_AXIS)</w:t>
-      </w:r>
-    </w:p>
-    <w:p>
-      <w:pPr>
-        <w:spacing w:before="0" w:after="0" w:line="240" w:lineRule="auto"/>
-      </w:pPr>
-      <w:r>
-        <w:rPr>
-          <w:rFonts w:ascii="Consolas" w:hAnsi="Consolas" w:eastAsia="Consolas" w:cs="Consolas"/>
-          <w:sz w:val="15"/>
-          <w:noProof/>
-        </w:rPr>
-        <w:t xml:space="preserve">    fig.text(0.53, 0.015, 'Raman Shift (cm$^{-1}$)', ha='center', fontsize=FS_AXIS)</w:t>
-      </w:r>
-    </w:p>
-    <w:p>
-      <w:pPr>
-        <w:spacing w:before="0" w:after="0" w:line="240" w:lineRule="auto"/>
-      </w:pPr>
-      <w:r>
-        <w:rPr>
-          <w:rFonts w:ascii="Consolas" w:hAnsi="Consolas" w:eastAsia="Consolas" w:cs="Consolas"/>
-          <w:sz w:val="15"/>
-          <w:noProof/>
-        </w:rPr>
-        <w:t xml:space="preserve">    fig.subplots_adjust(left=0.07, right=0.98, bottom=0.07, top=0.98)</w:t>
+        <w:t xml:space="preserve">    axL.set_ylabel('Intensity (a.u.)', fontsize=FS_AXIS)</w:t>
+      </w:r>
+    </w:p>
+    <w:p>
+      <w:pPr>
+        <w:spacing w:before="0" w:after="0" w:line="240" w:lineRule="auto"/>
+      </w:pPr>
+      <w:r>
+        <w:rPr>
+          <w:rFonts w:ascii="Consolas" w:hAnsi="Consolas" w:eastAsia="Consolas" w:cs="Consolas"/>
+          <w:sz w:val="15"/>
+          <w:noProof/>
+        </w:rPr>
+        <w:t xml:space="preserve">    fig.text(0.53, 0.018, 'Raman Shift (cm$^{-1}$)', ha='center', fontsize=FS_AXIS)</w:t>
+      </w:r>
+    </w:p>
+    <w:p>
+      <w:pPr>
+        <w:spacing w:before="0" w:after="0" w:line="240" w:lineRule="auto"/>
+      </w:pPr>
+      <w:r>
+        <w:rPr>
+          <w:rFonts w:ascii="Consolas" w:hAnsi="Consolas" w:eastAsia="Consolas" w:cs="Consolas"/>
+          <w:sz w:val="15"/>
+          <w:noProof/>
+        </w:rPr>
+        <w:t xml:space="preserve">    fig.subplots_adjust(left=0.055, right=0.985, bottom=0.10, top=0.98)</w:t>
       </w:r>
     </w:p>
     <w:p>
@@ -3964,7 +3990,7 @@
           <w:sz w:val="15"/>
           <w:noProof/>
         </w:rPr>
-        <w:t xml:space="preserve">                     color=COL['CaF2'] if sub == 'CaF2' else COL[s], fontsize=FS_NAME, ha='left', va='top')</w:t>
+        <w:t xml:space="preserve">                     color=COL[s], fontsize=FS_NAME, ha='left', va='top')</w:t>
       </w:r>
     </w:p>
     <w:p>

</xml_diff>